<commit_message>
Modified rulebook to explain Law Tags and new sanction system
</commit_message>
<xml_diff>
--- a/Rulebook.docx
+++ b/Rulebook.docx
@@ -1,6 +1,6 @@
 
 <file path=word/document.xml><?xml version="1.0" encoding="utf-8"?>
-<w:document xmlns:wpc="http://schemas.microsoft.com/office/word/2010/wordprocessingCanvas" xmlns:cx="http://schemas.microsoft.com/office/drawing/2014/chartex" xmlns:cx1="http://schemas.microsoft.com/office/drawing/2015/9/8/chartex" xmlns:cx2="http://schemas.microsoft.com/office/drawing/2015/10/21/chartex" xmlns:cx3="http://schemas.microsoft.com/office/drawing/2016/5/9/chartex" xmlns:cx4="http://schemas.microsoft.com/office/drawing/2016/5/10/chartex" xmlns:cx5="http://schemas.microsoft.com/office/drawing/2016/5/11/chartex" xmlns:cx6="http://schemas.microsoft.com/office/drawing/2016/5/12/chartex" xmlns:cx7="http://schemas.microsoft.com/office/drawing/2016/5/13/chartex" xmlns:cx8="http://schemas.microsoft.com/office/drawing/2016/5/14/chartex" xmlns:mc="http://schemas.openxmlformats.org/markup-compatibility/2006" xmlns:aink="http://schemas.microsoft.com/office/drawing/2016/ink" xmlns:am3d="http://schemas.microsoft.com/office/drawing/2017/model3d" xmlns:o="urn:schemas-microsoft-com:office:office" xmlns:oel="http://schemas.microsoft.com/office/2019/extlst" xmlns:r="http://schemas.openxmlformats.org/officeDocument/2006/relationships" xmlns:m="http://schemas.openxmlformats.org/officeDocument/2006/math" xmlns:v="urn:schemas-microsoft-com:vml" xmlns:wp14="http://schemas.microsoft.com/office/word/2010/wordprocessingDrawing" xmlns:wp="http://schemas.openxmlformats.org/drawingml/2006/wordprocessingDrawing" xmlns:w10="urn:schemas-microsoft-com:office:word" xmlns:w="http://schemas.openxmlformats.org/wordprocessingml/2006/main" xmlns:w14="http://schemas.microsoft.com/office/word/2010/wordml" xmlns:w15="http://schemas.microsoft.com/office/word/2012/wordml" xmlns:w16cei="http://schemas.microsoft.com/office/word/2026/wordml/cei" xmlns:w16cex="http://schemas.microsoft.com/office/word/2018/wordml/cex" xmlns:w16cid="http://schemas.microsoft.com/office/word/2016/wordml/cid" xmlns:w16="http://schemas.microsoft.com/office/word/2018/wordml" xmlns:w16du="http://schemas.microsoft.com/office/word/2023/wordml/word16du" xmlns:w16sdtdh="http://schemas.microsoft.com/office/word/2020/wordml/sdtdatahash" xmlns:w16sdtfl="http://schemas.microsoft.com/office/word/2024/wordml/sdtformatlock" xmlns:w16se="http://schemas.microsoft.com/office/word/2015/wordml/symex" xmlns:wpg="http://schemas.microsoft.com/office/word/2010/wordprocessingGroup" xmlns:wpi="http://schemas.microsoft.com/office/word/2010/wordprocessingInk" xmlns:wne="http://schemas.microsoft.com/office/word/2006/wordml" xmlns:wps="http://schemas.microsoft.com/office/word/2010/wordprocessingShape" mc:Ignorable="w14 w15 w16se w16cid w16 w16cex w16sdtdh w16sdtfl w16du wp14">
+<w:document xmlns:wpc="http://schemas.microsoft.com/office/word/2010/wordprocessingCanvas" xmlns:cx="http://schemas.microsoft.com/office/drawing/2014/chartex" xmlns:cx1="http://schemas.microsoft.com/office/drawing/2015/9/8/chartex" xmlns:cx2="http://schemas.microsoft.com/office/drawing/2015/10/21/chartex" xmlns:cx3="http://schemas.microsoft.com/office/drawing/2016/5/9/chartex" xmlns:cx4="http://schemas.microsoft.com/office/drawing/2016/5/10/chartex" xmlns:cx5="http://schemas.microsoft.com/office/drawing/2016/5/11/chartex" xmlns:cx6="http://schemas.microsoft.com/office/drawing/2016/5/12/chartex" xmlns:cx7="http://schemas.microsoft.com/office/drawing/2016/5/13/chartex" xmlns:cx8="http://schemas.microsoft.com/office/drawing/2016/5/14/chartex" xmlns:mc="http://schemas.openxmlformats.org/markup-compatibility/2006" xmlns:aink="http://schemas.microsoft.com/office/drawing/2016/ink" xmlns:am3d="http://schemas.microsoft.com/office/drawing/2017/model3d" xmlns:o="urn:schemas-microsoft-com:office:office" xmlns:oel="http://schemas.microsoft.com/office/2019/extlst" xmlns:r="http://schemas.openxmlformats.org/officeDocument/2006/relationships" xmlns:m="http://schemas.openxmlformats.org/officeDocument/2006/math" xmlns:v="urn:schemas-microsoft-com:vml" xmlns:wp14="http://schemas.microsoft.com/office/word/2010/wordprocessingDrawing" xmlns:wp="http://schemas.openxmlformats.org/drawingml/2006/wordprocessingDrawing" xmlns:w10="urn:schemas-microsoft-com:office:word" xmlns:w="http://schemas.openxmlformats.org/wordprocessingml/2006/main" xmlns:w14="http://schemas.microsoft.com/office/word/2010/wordml" xmlns:w15="http://schemas.microsoft.com/office/word/2012/wordml" xmlns:w16cex="http://schemas.microsoft.com/office/word/2018/wordml/cex" xmlns:w16cid="http://schemas.microsoft.com/office/word/2016/wordml/cid" xmlns:w16="http://schemas.microsoft.com/office/word/2018/wordml" xmlns:w16du="http://schemas.microsoft.com/office/word/2023/wordml/word16du" xmlns:w16sdtdh="http://schemas.microsoft.com/office/word/2020/wordml/sdtdatahash" xmlns:w16sdtfl="http://schemas.microsoft.com/office/word/2024/wordml/sdtformatlock" xmlns:w16se="http://schemas.microsoft.com/office/word/2015/wordml/symex" xmlns:wpg="http://schemas.microsoft.com/office/word/2010/wordprocessingGroup" xmlns:wpi="http://schemas.microsoft.com/office/word/2010/wordprocessingInk" xmlns:wne="http://schemas.microsoft.com/office/word/2006/wordml" xmlns:wps="http://schemas.microsoft.com/office/word/2010/wordprocessingShape" mc:Ignorable="w14 w15 w16se w16cid w16 w16cex w16sdtdh w16sdtfl w16du wp14">
   <w:body>
     <w:p>
       <w:pPr>
@@ -333,13 +333,28 @@
         <w:rPr>
           <w:rStyle w:val="SubtleReference"/>
         </w:rPr>
-        <w:t>Sanction Tokens</w:t>
-      </w:r>
-      <w:r>
-        <w:t xml:space="preserve"> – Reminds players that the action the token is on might have a penalty for players vio</w:t>
-      </w:r>
-      <w:r>
-        <w:t>lating Edicts.</w:t>
+        <w:t>Law Tags</w:t>
+      </w:r>
+      <w:r>
+        <w:t xml:space="preserve"> – </w:t>
+      </w:r>
+      <w:r>
+        <w:t>Identifies Laws and their sanctioned action on the board</w:t>
+      </w:r>
+      <w:r>
+        <w:t xml:space="preserve"> and r</w:t>
+      </w:r>
+      <w:r>
+        <w:t>eminds players that the action the token is on might have a penalty for players vio</w:t>
+      </w:r>
+      <w:r>
+        <w:t xml:space="preserve">lating </w:t>
+      </w:r>
+      <w:r>
+        <w:t>the corresponding Law</w:t>
+      </w:r>
+      <w:r>
+        <w:t>.</w:t>
       </w:r>
     </w:p>
     <w:p>
@@ -740,6 +755,7 @@
         <w:rPr>
           <w:rStyle w:val="SubtleReference"/>
         </w:rPr>
+        <w:lastRenderedPageBreak/>
         <w:t>Honor Track</w:t>
       </w:r>
       <w:r>
@@ -754,7 +770,6 @@
         <w:rPr>
           <w:rStyle w:val="SubtleReference"/>
         </w:rPr>
-        <w:lastRenderedPageBreak/>
         <w:t>Province</w:t>
       </w:r>
       <w:r>
@@ -971,81 +986,114 @@
     <w:p>
       <w:pPr>
         <w:pStyle w:val="ListParagraph"/>
-      </w:pPr>
-      <w:r>
-        <w:t>Roll the Market Rate Die</w:t>
-      </w:r>
-      <w:r>
-        <w:t xml:space="preserve"> and place it on the corresponding space, next to the Royal Bank</w:t>
-      </w:r>
-      <w:r>
-        <w:t>.</w:t>
-      </w:r>
-    </w:p>
-    <w:p>
-      <w:pPr>
-        <w:pStyle w:val="ListParagraph"/>
-      </w:pPr>
-      <w:r>
-        <w:t>Give the King’s Favor to the oldest (most honored) player.</w:t>
-      </w:r>
-    </w:p>
-    <w:p>
-      <w:pPr>
-        <w:pStyle w:val="ListParagraph"/>
-      </w:pPr>
-      <w:r>
-        <w:t>Reveal 3 random Law cards to the table</w:t>
-      </w:r>
-      <w:r>
-        <w:t>.</w:t>
-      </w:r>
-      <w:r>
-        <w:t xml:space="preserve"> </w:t>
-      </w:r>
-      <w:r>
-        <w:t>C</w:t>
-      </w:r>
-      <w:r>
-        <w:t>ollectively choose one to be</w:t>
-      </w:r>
-      <w:r>
-        <w:t>come an Edict</w:t>
-      </w:r>
-      <w:r>
-        <w:t xml:space="preserve"> and discard the other two</w:t>
-      </w:r>
-      <w:r>
-        <w:t>, with the player holding the King’s Favor breaking ties</w:t>
-      </w:r>
-      <w:r>
-        <w:t xml:space="preserve">. Once chosen, roll a non-player die to determine the </w:t>
-      </w:r>
-      <w:r>
-        <w:t xml:space="preserve">Threshold of the Edict. This </w:t>
-      </w:r>
-      <w:r>
-        <w:t>represents the historical Edict inherited from the previous generation of rulers of the Empire.</w:t>
-      </w:r>
-      <w:r>
-        <w:t xml:space="preserve"> The player to the right of the player </w:t>
-      </w:r>
-      <w:r>
-        <w:t xml:space="preserve">holding the King’s Favor </w:t>
-      </w:r>
-      <w:r>
-        <w:t>(last in turn order) takes sponsorship of the starting Edict.</w:t>
-      </w:r>
-    </w:p>
-    <w:p>
-      <w:pPr>
-        <w:pStyle w:val="ListParagraph"/>
         <w:numPr>
           <w:ilvl w:val="0"/>
           <w:numId w:val="14"/>
         </w:numPr>
       </w:pPr>
       <w:r>
+        <w:t>Roll the Market Rate Die</w:t>
+      </w:r>
+      <w:r>
+        <w:t xml:space="preserve"> and place it on the corresponding space, next to the Royal Bank</w:t>
+      </w:r>
+      <w:r>
+        <w:t>.</w:t>
+      </w:r>
+    </w:p>
+    <w:p>
+      <w:pPr>
+        <w:pStyle w:val="ListParagraph"/>
+        <w:numPr>
+          <w:ilvl w:val="0"/>
+          <w:numId w:val="14"/>
+        </w:numPr>
+      </w:pPr>
+      <w:r>
+        <w:t>Give the King’s Favor to the oldest (most honored</w:t>
+      </w:r>
+      <w:r>
+        <w:t>, most wise</w:t>
+      </w:r>
+      <w:r>
+        <w:t>) player.</w:t>
+      </w:r>
+    </w:p>
+    <w:p>
+      <w:pPr>
+        <w:pStyle w:val="ListParagraph"/>
+        <w:numPr>
+          <w:ilvl w:val="0"/>
+          <w:numId w:val="14"/>
+        </w:numPr>
+      </w:pPr>
+      <w:r>
+        <w:t>Reveal 3 random Law cards to the table</w:t>
+      </w:r>
+      <w:r>
+        <w:t>.</w:t>
+      </w:r>
+      <w:r>
+        <w:t xml:space="preserve"> </w:t>
+      </w:r>
+      <w:r>
+        <w:t>C</w:t>
+      </w:r>
+      <w:r>
+        <w:t>ollectively choose one to be</w:t>
+      </w:r>
+      <w:r>
+        <w:t>come an Edict</w:t>
+      </w:r>
+      <w:r>
+        <w:t xml:space="preserve"> and discard the other two</w:t>
+      </w:r>
+      <w:r>
+        <w:t>, with the player holding the King’s Favor breaking ties</w:t>
+      </w:r>
+      <w:r>
+        <w:t xml:space="preserve">. Once chosen, roll a non-player die to determine the </w:t>
+      </w:r>
+      <w:r>
+        <w:t xml:space="preserve">Threshold of the Edict. This </w:t>
+      </w:r>
+      <w:r>
+        <w:t xml:space="preserve">represents </w:t>
+      </w:r>
+      <w:r>
+        <w:t>a</w:t>
+      </w:r>
+      <w:r>
+        <w:t xml:space="preserve"> historical Edict inherited from the previous generation of rulers of the Empire.</w:t>
+      </w:r>
+      <w:r>
+        <w:t xml:space="preserve"> The player to the right of the player </w:t>
+      </w:r>
+      <w:r>
+        <w:t xml:space="preserve">holding the King’s Favor </w:t>
+      </w:r>
+      <w:r>
+        <w:t>(last in turn order) takes sponsorship of the starting Edict</w:t>
+      </w:r>
+      <w:r>
+        <w:t xml:space="preserve"> and chooses its sanction</w:t>
+      </w:r>
+      <w:r>
+        <w:t>.</w:t>
+      </w:r>
+      <w:r>
+        <w:t xml:space="preserve"> Place a Law Tag on the Edict and a matching Law Tag on any action on the board to sanction.</w:t>
+      </w:r>
+    </w:p>
+    <w:p>
+      <w:pPr>
+        <w:pStyle w:val="ListParagraph"/>
+        <w:numPr>
+          <w:ilvl w:val="0"/>
+          <w:numId w:val="14"/>
+        </w:numPr>
+      </w:pPr>
+      <w:r>
         <w:t>Draft Investments</w:t>
       </w:r>
       <w:r>
@@ -1106,6 +1154,7 @@
         </w:numPr>
       </w:pPr>
       <w:r>
+        <w:lastRenderedPageBreak/>
         <w:t>Repeat Steps 2 and 3 until all Players have exactly 4 Investments. Discard any remaining Investments.</w:t>
       </w:r>
     </w:p>
@@ -1118,7 +1167,6 @@
         </w:numPr>
       </w:pPr>
       <w:r>
-        <w:lastRenderedPageBreak/>
         <w:t>Each Player takes one die per Investment and distributes 8 levels between their four Investments. The sum of the Investment levels must be 8.</w:t>
       </w:r>
     </w:p>
@@ -1191,27 +1239,13 @@
     <w:p>
       <w:pPr>
         <w:pStyle w:val="ListParagraph"/>
-      </w:pPr>
-      <w:r>
-        <w:t xml:space="preserve">Give each Player </w:t>
-      </w:r>
-      <w:r>
-        <w:t>one</w:t>
-      </w:r>
-      <w:r>
-        <w:t xml:space="preserve"> card marker of their own color.</w:t>
-      </w:r>
-    </w:p>
-    <w:p>
-      <w:pPr>
-        <w:pStyle w:val="ListParagraph"/>
         <w:numPr>
           <w:ilvl w:val="1"/>
           <w:numId w:val="14"/>
         </w:numPr>
       </w:pPr>
       <w:r>
-        <w:t>Deal 3 Laws to each Player. Make sure players do not look at the Laws they are dealt yet.</w:t>
+        <w:t>Give each Player one card marker of their own color.</w:t>
       </w:r>
     </w:p>
     <w:p>
@@ -1223,52 +1257,19 @@
         </w:numPr>
       </w:pPr>
       <w:r>
+        <w:t>Deal 3 Laws to each Player. Make sure players do not look at the Laws they are dealt yet.</w:t>
+      </w:r>
+    </w:p>
+    <w:p>
+      <w:pPr>
+        <w:pStyle w:val="ListParagraph"/>
+        <w:numPr>
+          <w:ilvl w:val="1"/>
+          <w:numId w:val="14"/>
+        </w:numPr>
+      </w:pPr>
+      <w:r>
         <w:t>At the same time, all Players look at their Laws and race to do the following:</w:t>
-      </w:r>
-    </w:p>
-    <w:p>
-      <w:pPr>
-        <w:pStyle w:val="ListParagraph"/>
-      </w:pPr>
-      <w:r>
-        <w:t xml:space="preserve">Choose one Law to submit to the </w:t>
-      </w:r>
-      <w:r>
-        <w:t xml:space="preserve">Law </w:t>
-      </w:r>
-      <w:r>
-        <w:t>Queue</w:t>
-      </w:r>
-      <w:r>
-        <w:t>.</w:t>
-      </w:r>
-    </w:p>
-    <w:p>
-      <w:pPr>
-        <w:pStyle w:val="ListParagraph"/>
-      </w:pPr>
-      <w:r>
-        <w:t>Place your Marker on the Law</w:t>
-      </w:r>
-      <w:r>
-        <w:t>.</w:t>
-      </w:r>
-    </w:p>
-    <w:p>
-      <w:pPr>
-        <w:pStyle w:val="ListParagraph"/>
-      </w:pPr>
-      <w:r>
-        <w:t xml:space="preserve">Place your marked Law faceup at the back of the </w:t>
-      </w:r>
-      <w:r>
-        <w:t xml:space="preserve">Law </w:t>
-      </w:r>
-      <w:r>
-        <w:t>Queue</w:t>
-      </w:r>
-      <w:r>
-        <w:t>.</w:t>
       </w:r>
     </w:p>
     <w:p>
@@ -1280,6 +1281,63 @@
         </w:numPr>
       </w:pPr>
       <w:r>
+        <w:t xml:space="preserve">Choose one Law to submit to the </w:t>
+      </w:r>
+      <w:r>
+        <w:t xml:space="preserve">Law </w:t>
+      </w:r>
+      <w:r>
+        <w:t>Queue</w:t>
+      </w:r>
+      <w:r>
+        <w:t>.</w:t>
+      </w:r>
+    </w:p>
+    <w:p>
+      <w:pPr>
+        <w:pStyle w:val="ListParagraph"/>
+        <w:numPr>
+          <w:ilvl w:val="2"/>
+          <w:numId w:val="14"/>
+        </w:numPr>
+      </w:pPr>
+      <w:r>
+        <w:t>Place your Marker on the Law</w:t>
+      </w:r>
+      <w:r>
+        <w:t>.</w:t>
+      </w:r>
+    </w:p>
+    <w:p>
+      <w:pPr>
+        <w:pStyle w:val="ListParagraph"/>
+        <w:numPr>
+          <w:ilvl w:val="2"/>
+          <w:numId w:val="14"/>
+        </w:numPr>
+      </w:pPr>
+      <w:r>
+        <w:t xml:space="preserve">Place your marked Law faceup at the back of the </w:t>
+      </w:r>
+      <w:r>
+        <w:t xml:space="preserve">Law </w:t>
+      </w:r>
+      <w:r>
+        <w:t>Queue</w:t>
+      </w:r>
+      <w:r>
+        <w:t>.</w:t>
+      </w:r>
+    </w:p>
+    <w:p>
+      <w:pPr>
+        <w:pStyle w:val="ListParagraph"/>
+        <w:numPr>
+          <w:ilvl w:val="2"/>
+          <w:numId w:val="14"/>
+        </w:numPr>
+      </w:pPr>
+      <w:r>
         <w:t>Discard remaining Laws</w:t>
       </w:r>
       <w:r>
@@ -1295,7 +1353,43 @@
         </w:numPr>
       </w:pPr>
       <w:r>
-        <w:t>Once all players have submitted a Law, the Player who submitted the first Law makes it the Deliberated Law and chooses its Threshold.</w:t>
+        <w:t xml:space="preserve">In the order of </w:t>
+      </w:r>
+      <w:r>
+        <w:t>Laws in the Queue, each sponsor should t</w:t>
+      </w:r>
+      <w:r>
+        <w:t>ake a pair of Law Tags, place one on the</w:t>
+      </w:r>
+      <w:r>
+        <w:t>ir</w:t>
+      </w:r>
+      <w:r>
+        <w:t xml:space="preserve"> Law in the Law Queue, and place the other on an action space of </w:t>
+      </w:r>
+      <w:r>
+        <w:t xml:space="preserve">their </w:t>
+      </w:r>
+      <w:r>
+        <w:t>choice.</w:t>
+      </w:r>
+    </w:p>
+    <w:p>
+      <w:pPr>
+        <w:pStyle w:val="ListParagraph"/>
+        <w:numPr>
+          <w:ilvl w:val="1"/>
+          <w:numId w:val="14"/>
+        </w:numPr>
+      </w:pPr>
+      <w:r>
+        <w:t>Once all players have submitted a Law</w:t>
+      </w:r>
+      <w:r>
+        <w:t xml:space="preserve"> and chosen their sanctioned action</w:t>
+      </w:r>
+      <w:r>
+        <w:t>, the Player who submitted the first Law makes it the Deliberated Law and chooses its Threshold.</w:t>
       </w:r>
     </w:p>
     <w:p>
@@ -1364,6 +1458,7 @@
         </w:numPr>
       </w:pPr>
       <w:r>
+        <w:lastRenderedPageBreak/>
         <w:t>2 cards from each deck</w:t>
       </w:r>
       <w:r>
@@ -1373,6 +1468,10 @@
     <w:p>
       <w:pPr>
         <w:pStyle w:val="ListParagraph"/>
+        <w:numPr>
+          <w:ilvl w:val="1"/>
+          <w:numId w:val="14"/>
+        </w:numPr>
       </w:pPr>
       <w:r>
         <w:t>1 Scheme Pouch with 2 Card Markers from each Player</w:t>
@@ -1386,7 +1485,6 @@
         <w:pStyle w:val="Heading1"/>
       </w:pPr>
       <w:r>
-        <w:lastRenderedPageBreak/>
         <w:t xml:space="preserve">4. </w:t>
       </w:r>
       <w:r>
@@ -1640,6 +1738,7 @@
         <w:pStyle w:val="ListParagraph"/>
       </w:pPr>
       <w:r>
+        <w:lastRenderedPageBreak/>
         <w:t xml:space="preserve">Place one of their unused Leaders onto an action space </w:t>
       </w:r>
       <w:r>
@@ -1663,27 +1762,537 @@
         <w:pStyle w:val="ListParagraph"/>
       </w:pPr>
       <w:r>
+        <w:t>The player takes the corresponding action. The higher level the Leader used, the more effective the action can be.</w:t>
+      </w:r>
+      <w:r>
+        <w:t xml:space="preserve"> Once the action is complete, play continues to the next player.</w:t>
+      </w:r>
+    </w:p>
+    <w:p>
+      <w:r>
+        <w:t>The Action Phase continues until every player has used all their Leaders.</w:t>
+      </w:r>
+    </w:p>
+    <w:p>
+      <w:pPr>
+        <w:pStyle w:val="Heading2"/>
+      </w:pPr>
+      <w:r>
+        <w:t>5.</w:t>
+      </w:r>
+      <w:r>
+        <w:t>2. List of Actions</w:t>
+      </w:r>
+    </w:p>
+    <w:p>
+      <w:pPr>
+        <w:pStyle w:val="Heading3"/>
+      </w:pPr>
+      <w:r>
+        <w:t>5.2.1. Provincial Actions</w:t>
+      </w:r>
+    </w:p>
+    <w:p>
+      <w:r>
+        <w:t>These represent common actions involved in governing your province. Each may be used once per player per round.</w:t>
+      </w:r>
+    </w:p>
+    <w:p>
+      <w:pPr>
+        <w:pStyle w:val="ListParagraph"/>
+      </w:pPr>
+      <w:r>
+        <w:rPr>
+          <w:rStyle w:val="SubtleReference"/>
+        </w:rPr>
+        <w:t xml:space="preserve">Collect </w:t>
+      </w:r>
+      <w:r>
+        <w:t>– Gain 2 Commodities per Leader Level.</w:t>
+      </w:r>
+    </w:p>
+    <w:p>
+      <w:pPr>
+        <w:pStyle w:val="ListParagraph"/>
+      </w:pPr>
+      <w:r>
+        <w:rPr>
+          <w:rStyle w:val="SubtleReference"/>
+        </w:rPr>
+        <w:t xml:space="preserve">Brainstorm </w:t>
+      </w:r>
+      <w:r>
+        <w:t>– Draw 1 card per Leader Level from each deck.</w:t>
+      </w:r>
+    </w:p>
+    <w:p>
+      <w:pPr>
+        <w:pStyle w:val="ListParagraph"/>
+      </w:pPr>
+      <w:r>
+        <w:rPr>
+          <w:rStyle w:val="SubtleReference"/>
+        </w:rPr>
+        <w:t xml:space="preserve">Tax </w:t>
+      </w:r>
+      <w:r>
+        <w:t>– Take 1 Coin from each player violating your</w:t>
+      </w:r>
+      <w:r>
+        <w:t xml:space="preserve"> sponsored</w:t>
+      </w:r>
+      <w:r>
+        <w:t xml:space="preserve"> Edicts for each Edict they are violating. Keep 1 of the taken Coins per Leader level and put the rest in the Royal Bank.</w:t>
+      </w:r>
+    </w:p>
+    <w:p>
+      <w:pPr>
+        <w:pStyle w:val="ListParagraph"/>
+      </w:pPr>
+      <w:r>
+        <w:t>Laws taxed using this action will not be taxed during the Reports Phase.</w:t>
+      </w:r>
+    </w:p>
+    <w:p>
+      <w:pPr>
+        <w:pStyle w:val="ListParagraph"/>
+      </w:pPr>
+      <w:r>
+        <w:t xml:space="preserve">You may </w:t>
+      </w:r>
+      <w:r>
+        <w:t xml:space="preserve">not tax </w:t>
+      </w:r>
+      <w:r>
+        <w:t>Edicts</w:t>
+      </w:r>
+      <w:r>
+        <w:t xml:space="preserve"> sponsored by any other Player</w:t>
+      </w:r>
+      <w:r>
+        <w:t>.</w:t>
+      </w:r>
+    </w:p>
+    <w:p>
+      <w:pPr>
+        <w:pStyle w:val="ListParagraph"/>
+      </w:pPr>
+      <w:r>
+        <w:rPr>
+          <w:rStyle w:val="SubtleReference"/>
+        </w:rPr>
+        <w:t xml:space="preserve">Deploy </w:t>
+      </w:r>
+      <w:r>
+        <w:t xml:space="preserve">– Send 1 Troop per Leader Level to the leftmost empty Persian space on the Battlefield. Gain half (rounded up) </w:t>
+      </w:r>
+      <w:r>
+        <w:t xml:space="preserve">of </w:t>
+      </w:r>
+      <w:r>
+        <w:t>the number of your deployed Troops in Coins from the Royal Bank.</w:t>
+      </w:r>
+    </w:p>
+    <w:p>
+      <w:pPr>
+        <w:pStyle w:val="ListParagraph"/>
+      </w:pPr>
+      <w:r>
+        <w:t>Place the Leader used to Deploy in the Battlefield next to your Troops. This will help the Reports phase</w:t>
+      </w:r>
+    </w:p>
+    <w:p>
+      <w:pPr>
+        <w:pStyle w:val="ListParagraph"/>
+      </w:pPr>
+      <w:r>
+        <w:t xml:space="preserve">When using an Investment to Deploy </w:t>
+      </w:r>
+      <w:r>
+        <w:t xml:space="preserve">multiple times </w:t>
+      </w:r>
+      <w:r>
+        <w:t>in the same round, place your new Troops and Leader onto the same space of the Battlefield as the Troops and Leader you Deployed earlier.</w:t>
+      </w:r>
+    </w:p>
+    <w:p>
+      <w:pPr>
+        <w:pStyle w:val="ListParagraph"/>
+      </w:pPr>
+      <w:r>
+        <w:rPr>
+          <w:rStyle w:val="SubtleReference"/>
+        </w:rPr>
+        <w:t xml:space="preserve">Recruit </w:t>
+      </w:r>
+      <w:r>
+        <w:t xml:space="preserve">– Pay 1 Coin </w:t>
+      </w:r>
+      <w:r>
+        <w:t xml:space="preserve">per Leader Level to </w:t>
+      </w:r>
+      <w:r>
+        <w:t>the Free Bank and gain 1 Troop</w:t>
+      </w:r>
+      <w:r>
+        <w:t xml:space="preserve"> per Coin paid</w:t>
+      </w:r>
+      <w:r>
+        <w:t>.</w:t>
+      </w:r>
+    </w:p>
+    <w:p>
+      <w:pPr>
+        <w:pStyle w:val="ListParagraph"/>
+      </w:pPr>
+      <w:r>
+        <w:rPr>
+          <w:rStyle w:val="SubtleReference"/>
+        </w:rPr>
+        <w:t xml:space="preserve">Infiltrate </w:t>
+      </w:r>
+      <w:r>
+        <w:t xml:space="preserve">– Pay 1 Coin </w:t>
+      </w:r>
+      <w:r>
+        <w:t xml:space="preserve">per Leader Level </w:t>
+      </w:r>
+      <w:r>
+        <w:t>to the Free Bank and gain 1 Spy</w:t>
+      </w:r>
+      <w:r>
+        <w:t xml:space="preserve"> per Coin paid</w:t>
+      </w:r>
+      <w:r>
+        <w:t>.</w:t>
+      </w:r>
+    </w:p>
+    <w:p>
+      <w:pPr>
+        <w:pStyle w:val="ListParagraph"/>
+      </w:pPr>
+      <w:r>
+        <w:rPr>
+          <w:rStyle w:val="SubtleReference"/>
+        </w:rPr>
         <w:lastRenderedPageBreak/>
-        <w:t>The player takes the corresponding action. The higher level the Leader used, the more effective the action can be.</w:t>
-      </w:r>
-      <w:r>
-        <w:t xml:space="preserve"> Once the action is complete, play continues to the next player.</w:t>
-      </w:r>
-    </w:p>
-    <w:p>
-      <w:r>
-        <w:t>The Action Phase continues until every player has used all their Leaders.</w:t>
-      </w:r>
-    </w:p>
-    <w:p>
-      <w:pPr>
-        <w:pStyle w:val="Heading2"/>
-      </w:pPr>
-      <w:r>
-        <w:t>5.</w:t>
-      </w:r>
-      <w:r>
-        <w:t>2. List of Actions</w:t>
+        <w:t xml:space="preserve">Build </w:t>
+      </w:r>
+      <w:r>
+        <w:t xml:space="preserve">– Play </w:t>
+      </w:r>
+      <w:r>
+        <w:t>on</w:t>
+      </w:r>
+      <w:r>
+        <w:t xml:space="preserve">e </w:t>
+      </w:r>
+      <w:r>
+        <w:t xml:space="preserve">or more </w:t>
+      </w:r>
+      <w:r>
+        <w:t>Investment</w:t>
+      </w:r>
+      <w:r>
+        <w:t>s</w:t>
+      </w:r>
+      <w:r>
+        <w:t xml:space="preserve"> from your hand to the table, pay </w:t>
+      </w:r>
+      <w:r>
+        <w:t xml:space="preserve">up to </w:t>
+      </w:r>
+      <w:r>
+        <w:t xml:space="preserve">1 Commodity per Leader Level, and </w:t>
+      </w:r>
+      <w:r>
+        <w:t xml:space="preserve">distribute one level per Commodity paid between the </w:t>
+      </w:r>
+      <w:r>
+        <w:t>new Investments.</w:t>
+      </w:r>
+    </w:p>
+    <w:p>
+      <w:pPr>
+        <w:pStyle w:val="ListParagraph"/>
+      </w:pPr>
+      <w:r>
+        <w:t>There is no limit to the number of Investments a player may have.</w:t>
+      </w:r>
+    </w:p>
+    <w:p>
+      <w:pPr>
+        <w:pStyle w:val="ListParagraph"/>
+      </w:pPr>
+      <w:r>
+        <w:t>The maximum Investment level is either 3 or 6, as shown on the Investment.</w:t>
+      </w:r>
+    </w:p>
+    <w:p>
+      <w:pPr>
+        <w:pStyle w:val="ListParagraph"/>
+      </w:pPr>
+      <w:r>
+        <w:rPr>
+          <w:rStyle w:val="SubtleReference"/>
+        </w:rPr>
+        <w:t>Upgrade</w:t>
+      </w:r>
+      <w:r>
+        <w:rPr>
+          <w:rStyle w:val="SubtleReference"/>
+        </w:rPr>
+        <w:t xml:space="preserve"> </w:t>
+      </w:r>
+      <w:r>
+        <w:t xml:space="preserve">– Pay </w:t>
+      </w:r>
+      <w:r>
+        <w:t xml:space="preserve">up to </w:t>
+      </w:r>
+      <w:r>
+        <w:t xml:space="preserve">1 Commodity </w:t>
+      </w:r>
+      <w:r>
+        <w:t xml:space="preserve">per Leader Level </w:t>
+      </w:r>
+      <w:r>
+        <w:t xml:space="preserve">and </w:t>
+      </w:r>
+      <w:r>
+        <w:t>distribute one level per Commodity paid between your existing Investments</w:t>
+      </w:r>
+      <w:r>
+        <w:t>.</w:t>
+      </w:r>
+    </w:p>
+    <w:p>
+      <w:pPr>
+        <w:pStyle w:val="ListParagraph"/>
+      </w:pPr>
+      <w:r>
+        <w:t xml:space="preserve">The maximum Investment level is either 3 or 6, </w:t>
+      </w:r>
+      <w:r>
+        <w:t xml:space="preserve">as shown </w:t>
+      </w:r>
+      <w:r>
+        <w:t>on the Investment.</w:t>
+      </w:r>
+    </w:p>
+    <w:p>
+      <w:pPr>
+        <w:pStyle w:val="ListParagraph"/>
+      </w:pPr>
+      <w:r>
+        <w:rPr>
+          <w:rStyle w:val="SubtleReference"/>
+        </w:rPr>
+        <w:t xml:space="preserve">Commission </w:t>
+      </w:r>
+      <w:r>
+        <w:t xml:space="preserve">– Immediately gain a new Leader and place it on this action space next to your </w:t>
+      </w:r>
+      <w:r>
+        <w:t xml:space="preserve">existing </w:t>
+      </w:r>
+      <w:r>
+        <w:t xml:space="preserve">Leader. Set the new Leader’s level to half (rounded up) of the </w:t>
+      </w:r>
+      <w:r>
+        <w:t>existing</w:t>
+      </w:r>
+      <w:r>
+        <w:t xml:space="preserve"> Leader’s level.</w:t>
+      </w:r>
+    </w:p>
+    <w:p>
+      <w:pPr>
+        <w:pStyle w:val="ListParagraph"/>
+      </w:pPr>
+      <w:r>
+        <w:t>The maximum number of Leaders a player may have is 10.</w:t>
+      </w:r>
+    </w:p>
+    <w:p>
+      <w:pPr>
+        <w:pStyle w:val="ListParagraph"/>
+      </w:pPr>
+      <w:r>
+        <w:rPr>
+          <w:rStyle w:val="SubtleReference"/>
+        </w:rPr>
+        <w:t xml:space="preserve">Promote </w:t>
+      </w:r>
+      <w:r>
+        <w:t>– Immediately increase your Leader’s Level by 1.</w:t>
+      </w:r>
+    </w:p>
+    <w:p>
+      <w:pPr>
+        <w:pStyle w:val="ListParagraph"/>
+      </w:pPr>
+      <w:r>
+        <w:t xml:space="preserve">The maximum </w:t>
+      </w:r>
+      <w:r>
+        <w:t xml:space="preserve">Leader level </w:t>
+      </w:r>
+      <w:r>
+        <w:t xml:space="preserve">is </w:t>
+      </w:r>
+      <w:r>
+        <w:t>6.</w:t>
+      </w:r>
+    </w:p>
+    <w:p>
+      <w:pPr>
+        <w:pStyle w:val="ListParagraph"/>
+      </w:pPr>
+      <w:r>
+        <w:rPr>
+          <w:rStyle w:val="SubtleReference"/>
+        </w:rPr>
+        <w:t xml:space="preserve">Sue </w:t>
+      </w:r>
+      <w:r>
+        <w:t xml:space="preserve">– Initiate a Trial against another player. The </w:t>
+      </w:r>
+      <w:r>
+        <w:t xml:space="preserve">other </w:t>
+      </w:r>
+      <w:r>
+        <w:t xml:space="preserve">player must immediately place an unused </w:t>
+      </w:r>
+      <w:r>
+        <w:t>L</w:t>
+      </w:r>
+      <w:r>
+        <w:t xml:space="preserve">eader </w:t>
+      </w:r>
+      <w:r>
+        <w:t xml:space="preserve">of their choice </w:t>
+      </w:r>
+      <w:r>
+        <w:t>on this action. The two players then perform a Trial</w:t>
+      </w:r>
+      <w:r>
+        <w:t>, following the instructions in 7.2</w:t>
+      </w:r>
+      <w:r>
+        <w:t>.</w:t>
+      </w:r>
+    </w:p>
+    <w:p>
+      <w:pPr>
+        <w:pStyle w:val="ListParagraph"/>
+      </w:pPr>
+      <w:r>
+        <w:t xml:space="preserve">The other player </w:t>
+      </w:r>
+      <w:r>
+        <w:t>may</w:t>
+      </w:r>
+      <w:r>
+        <w:t xml:space="preserve"> </w:t>
+      </w:r>
+      <w:r>
+        <w:t xml:space="preserve">not </w:t>
+      </w:r>
+      <w:r>
+        <w:t>deny performing this action.</w:t>
+      </w:r>
+    </w:p>
+    <w:p>
+      <w:pPr>
+        <w:pStyle w:val="ListParagraph"/>
+      </w:pPr>
+      <w:r>
+        <w:rPr>
+          <w:rStyle w:val="SubtleReference"/>
+        </w:rPr>
+        <w:t>Negotiate</w:t>
+      </w:r>
+      <w:r>
+        <w:rPr>
+          <w:rStyle w:val="SubtleReference"/>
+        </w:rPr>
+        <w:t xml:space="preserve"> </w:t>
+      </w:r>
+      <w:r>
+        <w:t xml:space="preserve">– </w:t>
+      </w:r>
+      <w:r>
+        <w:t xml:space="preserve">Form an alliance with another player. The other player </w:t>
+      </w:r>
+      <w:r>
+        <w:t>immediately</w:t>
+      </w:r>
+      <w:r>
+        <w:t xml:space="preserve"> places an unused Leader </w:t>
+      </w:r>
+      <w:r>
+        <w:t xml:space="preserve">of their choice </w:t>
+      </w:r>
+      <w:r>
+        <w:t>on this action.</w:t>
+      </w:r>
+      <w:r>
+        <w:t xml:space="preserve"> The two players</w:t>
+      </w:r>
+      <w:r>
+        <w:t xml:space="preserve"> then exchange 1 Alliance Token per Leader level they used.</w:t>
+      </w:r>
+    </w:p>
+    <w:p>
+      <w:pPr>
+        <w:pStyle w:val="ListParagraph"/>
+      </w:pPr>
+      <w:r>
+        <w:t>The other player may d</w:t>
+      </w:r>
+      <w:r>
+        <w:t>e</w:t>
+      </w:r>
+      <w:r>
+        <w:t>ny performing this action. In this case, the first player may choose another player to ally with or take the action back entirely.</w:t>
+      </w:r>
+    </w:p>
+    <w:p>
+      <w:pPr>
+        <w:pStyle w:val="ListParagraph"/>
+      </w:pPr>
+      <w:r>
+        <w:t xml:space="preserve">The two players using this action may only give 1 Alliance Token per Leader level they used. This may result in an uneven exchange </w:t>
+      </w:r>
+      <w:r>
+        <w:t xml:space="preserve">of Alliance Tokens </w:t>
+      </w:r>
+      <w:r>
+        <w:t>if the players used Leaders of unequal levels</w:t>
+      </w:r>
+      <w:r>
+        <w:t>.</w:t>
+      </w:r>
+    </w:p>
+    <w:p>
+      <w:pPr>
+        <w:pStyle w:val="Quote"/>
+      </w:pPr>
+      <w:r>
+        <w:t xml:space="preserve">Persian Fact: </w:t>
+      </w:r>
+      <w:r>
+        <w:t>Satraps handled their p</w:t>
+      </w:r>
+      <w:r>
+        <w:t>rovincial matters independently</w:t>
+      </w:r>
+      <w:r>
+        <w:t>, only involving the King when they needed help</w:t>
+      </w:r>
+      <w:r>
+        <w:t>.</w:t>
       </w:r>
     </w:p>
     <w:p>
@@ -1691,12 +2300,25 @@
         <w:pStyle w:val="Heading3"/>
       </w:pPr>
       <w:r>
-        <w:t>5.2.1. Provincial Actions</w:t>
-      </w:r>
-    </w:p>
-    <w:p>
-      <w:r>
-        <w:t>These represent common actions involved in governing your province. Each may be used once per player per round.</w:t>
+        <w:lastRenderedPageBreak/>
+        <w:t>5.2.2. Undermarket Actions</w:t>
+      </w:r>
+    </w:p>
+    <w:p>
+      <w:r>
+        <w:t xml:space="preserve">These </w:t>
+      </w:r>
+      <w:r>
+        <w:t xml:space="preserve">actions </w:t>
+      </w:r>
+      <w:r>
+        <w:t>represent illicit dealings outside the King’s oversight</w:t>
+      </w:r>
+      <w:r>
+        <w:t xml:space="preserve"> and come with a penalty for use</w:t>
+      </w:r>
+      <w:r>
+        <w:t>. Each may be used once per player per round.</w:t>
       </w:r>
     </w:p>
     <w:p>
@@ -1707,10 +2329,45 @@
         <w:rPr>
           <w:rStyle w:val="SubtleReference"/>
         </w:rPr>
-        <w:t xml:space="preserve">Collect </w:t>
-      </w:r>
-      <w:r>
-        <w:t>– Gain 2 Commodities per Leader Level.</w:t>
+        <w:t xml:space="preserve">Buy </w:t>
+      </w:r>
+      <w:r>
+        <w:t>– Pay 1 Coin per Leader Level and gain Commodities</w:t>
+      </w:r>
+      <w:r>
+        <w:t xml:space="preserve"> according to the Market Rate</w:t>
+      </w:r>
+      <w:r>
+        <w:t xml:space="preserve"> minus 1</w:t>
+      </w:r>
+      <w:r>
+        <w:t>.</w:t>
+      </w:r>
+      <w:r>
+        <w:t xml:space="preserve"> Once finished with the trade, decrease the Market Rate.</w:t>
+      </w:r>
+    </w:p>
+    <w:p>
+      <w:pPr>
+        <w:pStyle w:val="ListParagraph"/>
+      </w:pPr>
+      <w:r>
+        <w:t>Ex. At a Market Rate of 4, paying 2 Coins will earn you 6 Commodities. 2 * (4</w:t>
+      </w:r>
+      <w:r>
+        <w:t xml:space="preserve"> </w:t>
+      </w:r>
+      <w:r>
+        <w:t>-</w:t>
+      </w:r>
+      <w:r>
+        <w:t xml:space="preserve"> </w:t>
+      </w:r>
+      <w:r>
+        <w:t>1) = 6</w:t>
+      </w:r>
+      <w:r>
+        <w:t>.</w:t>
       </w:r>
     </w:p>
     <w:p>
@@ -1721,10 +2378,36 @@
         <w:rPr>
           <w:rStyle w:val="SubtleReference"/>
         </w:rPr>
-        <w:t xml:space="preserve">Brainstorm </w:t>
-      </w:r>
-      <w:r>
-        <w:t>– Draw 1 card per Leader Level from each deck.</w:t>
+        <w:t xml:space="preserve">Sell </w:t>
+      </w:r>
+      <w:r>
+        <w:t xml:space="preserve">– Pay Commodities and gain up to Leader </w:t>
+      </w:r>
+      <w:r>
+        <w:t>l</w:t>
+      </w:r>
+      <w:r>
+        <w:t>evel Coins according to the Market Rate plus 1</w:t>
+      </w:r>
+      <w:r>
+        <w:t>, rounded down</w:t>
+      </w:r>
+      <w:r>
+        <w:t>.</w:t>
+      </w:r>
+      <w:r>
+        <w:t xml:space="preserve"> Once finished with the trade, increase the Market Rate.</w:t>
+      </w:r>
+    </w:p>
+    <w:p>
+      <w:pPr>
+        <w:pStyle w:val="ListParagraph"/>
+      </w:pPr>
+      <w:r>
+        <w:t xml:space="preserve">Ex. At a Market Rate of 4, paying 10 Commodities will earn you 2 Coins. 10 / (4 + 1) </w:t>
+      </w:r>
+      <w:r>
+        <w:t>= 2.</w:t>
       </w:r>
     </w:p>
     <w:p>
@@ -1735,41 +2418,19 @@
         <w:rPr>
           <w:rStyle w:val="SubtleReference"/>
         </w:rPr>
-        <w:t xml:space="preserve">Tax </w:t>
-      </w:r>
-      <w:r>
-        <w:t>– Take 1 Coin from each player violating your</w:t>
-      </w:r>
-      <w:r>
-        <w:t xml:space="preserve"> sponsored</w:t>
-      </w:r>
-      <w:r>
-        <w:t xml:space="preserve"> Edicts for each Edict they are violating. Keep 1 of the taken Coins per Leader level and put the rest in the Royal Bank.</w:t>
-      </w:r>
-    </w:p>
-    <w:p>
-      <w:pPr>
-        <w:pStyle w:val="ListParagraph"/>
-      </w:pPr>
-      <w:r>
-        <w:t>Laws taxed using this action will not be taxed during the Reports Phase.</w:t>
-      </w:r>
-    </w:p>
-    <w:p>
-      <w:pPr>
-        <w:pStyle w:val="ListParagraph"/>
-      </w:pPr>
-      <w:r>
-        <w:t xml:space="preserve">You may </w:t>
-      </w:r>
-      <w:r>
-        <w:t xml:space="preserve">not tax </w:t>
-      </w:r>
-      <w:r>
-        <w:t>Edicts</w:t>
-      </w:r>
-      <w:r>
-        <w:t xml:space="preserve"> sponsored by any other Player</w:t>
+        <w:t xml:space="preserve">Monetize </w:t>
+      </w:r>
+      <w:r>
+        <w:t xml:space="preserve">– Discard Cards and gain up to Leader </w:t>
+      </w:r>
+      <w:r>
+        <w:t>l</w:t>
+      </w:r>
+      <w:r>
+        <w:t>evel Coins according to 7 minus the Market Rate minus 1</w:t>
+      </w:r>
+      <w:r>
+        <w:t>, rounded down</w:t>
       </w:r>
       <w:r>
         <w:t>.</w:t>
@@ -1780,41 +2441,86 @@
         <w:pStyle w:val="ListParagraph"/>
       </w:pPr>
       <w:r>
+        <w:t xml:space="preserve">Ex. At a Market Rate of 4, discarding 8 Cards will earn you 2 Coins. 8 / (7 - </w:t>
+      </w:r>
+      <w:r>
+        <w:t>(</w:t>
+      </w:r>
+      <w:r>
+        <w:t xml:space="preserve">4 </w:t>
+      </w:r>
+      <w:r>
+        <w:t>-</w:t>
+      </w:r>
+      <w:r>
+        <w:t xml:space="preserve"> 1)</w:t>
+      </w:r>
+      <w:r>
+        <w:t>)</w:t>
+      </w:r>
+      <w:r>
+        <w:t xml:space="preserve"> = 2.</w:t>
+      </w:r>
+    </w:p>
+    <w:p>
+      <w:pPr>
+        <w:pStyle w:val="ListParagraph"/>
+      </w:pPr>
+      <w:r>
         <w:rPr>
           <w:rStyle w:val="SubtleReference"/>
         </w:rPr>
-        <w:t xml:space="preserve">Deploy </w:t>
-      </w:r>
-      <w:r>
-        <w:t xml:space="preserve">– Send 1 Troop per Leader Level to the leftmost empty Persian space on the Battlefield. Gain half (rounded up) </w:t>
-      </w:r>
-      <w:r>
-        <w:t xml:space="preserve">of </w:t>
-      </w:r>
-      <w:r>
-        <w:t>the number of your deployed Troops in Coins from the Royal Bank.</w:t>
-      </w:r>
-    </w:p>
-    <w:p>
-      <w:pPr>
-        <w:pStyle w:val="ListParagraph"/>
-      </w:pPr>
-      <w:r>
-        <w:t>Place the Leader used to Deploy in the Battlefield next to your Troops. This will help the Reports phase</w:t>
-      </w:r>
-    </w:p>
-    <w:p>
-      <w:pPr>
-        <w:pStyle w:val="ListParagraph"/>
-      </w:pPr>
-      <w:r>
-        <w:t xml:space="preserve">When using an Investment to Deploy </w:t>
-      </w:r>
-      <w:r>
-        <w:t xml:space="preserve">multiple times </w:t>
-      </w:r>
-      <w:r>
-        <w:t>in the same round, place your new Troops and Leader onto the same space of the Battlefield as the Troops and Leader you Deployed earlier.</w:t>
+        <w:t xml:space="preserve">Donate </w:t>
+      </w:r>
+      <w:r>
+        <w:t>– Pay 1 Coin per Leader level</w:t>
+      </w:r>
+      <w:r>
+        <w:t xml:space="preserve"> to the Royal Bank and gain half (rounded up) the number of donated Coins</w:t>
+      </w:r>
+      <w:r>
+        <w:t xml:space="preserve"> minus 1</w:t>
+      </w:r>
+      <w:r>
+        <w:t xml:space="preserve"> in Honor.</w:t>
+      </w:r>
+    </w:p>
+    <w:p>
+      <w:pPr>
+        <w:pStyle w:val="ListParagraph"/>
+      </w:pPr>
+      <w:r>
+        <w:t>Ex. Donating 3 Coins will earn you 1 Honor. (3 – 1) / 2 = 1.</w:t>
+      </w:r>
+    </w:p>
+    <w:p>
+      <w:pPr>
+        <w:pStyle w:val="Quote"/>
+      </w:pPr>
+      <w:r>
+        <w:t>Imperial Reminder: The King frowns upon Undermarket dealings. Fortunately, frowns are not Laws.</w:t>
+      </w:r>
+    </w:p>
+    <w:p>
+      <w:pPr>
+        <w:pStyle w:val="Heading3"/>
+      </w:pPr>
+      <w:r>
+        <w:t>5.2.3. Court Actions</w:t>
+      </w:r>
+    </w:p>
+    <w:p>
+      <w:r>
+        <w:t xml:space="preserve">These actions represent </w:t>
+      </w:r>
+      <w:r>
+        <w:t xml:space="preserve">direct interactions with </w:t>
+      </w:r>
+      <w:r>
+        <w:t>the King and his Court</w:t>
+      </w:r>
+      <w:r>
+        <w:t>. Each may be used once per round by a single player.</w:t>
       </w:r>
     </w:p>
     <w:p>
@@ -1825,19 +2531,36 @@
         <w:rPr>
           <w:rStyle w:val="SubtleReference"/>
         </w:rPr>
-        <w:t xml:space="preserve">Recruit </w:t>
-      </w:r>
-      <w:r>
-        <w:t xml:space="preserve">– Pay 1 Coin </w:t>
-      </w:r>
-      <w:r>
-        <w:t xml:space="preserve">per Leader Level to </w:t>
-      </w:r>
-      <w:r>
-        <w:t>the Free Bank and gain 1 Troop</w:t>
-      </w:r>
-      <w:r>
-        <w:t xml:space="preserve"> per Coin paid</w:t>
+        <w:t xml:space="preserve">Petition </w:t>
+      </w:r>
+      <w:r>
+        <w:t>– Play 1 Law per Leader level from your hand to the back of the Law Queue.</w:t>
+      </w:r>
+      <w:r>
+        <w:t xml:space="preserve"> Put one of your Card Markers on each Law played.</w:t>
+      </w:r>
+    </w:p>
+    <w:p>
+      <w:pPr>
+        <w:pStyle w:val="ListParagraph"/>
+      </w:pPr>
+      <w:r>
+        <w:rPr>
+          <w:rStyle w:val="SubtleReference"/>
+        </w:rPr>
+        <w:t xml:space="preserve">Postpone </w:t>
+      </w:r>
+      <w:r>
+        <w:t>– Move the Deliberated Law 1 space per Leader level backward in the Law Queue. Immediately make the f</w:t>
+      </w:r>
+      <w:r>
+        <w:t>ir</w:t>
+      </w:r>
+      <w:r>
+        <w:t>st Law in the Queue the new Deliberated Law</w:t>
+      </w:r>
+      <w:r>
+        <w:t xml:space="preserve"> and set its Threshold</w:t>
       </w:r>
       <w:r>
         <w:t>.</w:t>
@@ -1851,452 +2574,71 @@
         <w:rPr>
           <w:rStyle w:val="SubtleReference"/>
         </w:rPr>
-        <w:t xml:space="preserve">Infiltrate </w:t>
-      </w:r>
-      <w:r>
-        <w:t xml:space="preserve">– Pay 1 Coin </w:t>
-      </w:r>
-      <w:r>
-        <w:t xml:space="preserve">per Leader Level </w:t>
-      </w:r>
-      <w:r>
-        <w:t>to the Free Bank and gain 1 Spy</w:t>
-      </w:r>
-      <w:r>
-        <w:t xml:space="preserve"> per Coin paid</w:t>
+        <w:t xml:space="preserve">Prioritize </w:t>
+      </w:r>
+      <w:r>
+        <w:t>– Move any Law in the Queue, except the Deliberated Law, forward 1 space per Leader Level.</w:t>
+      </w:r>
+    </w:p>
+    <w:p>
+      <w:pPr>
+        <w:pStyle w:val="ListParagraph"/>
+      </w:pPr>
+      <w:r>
+        <w:rPr>
+          <w:rStyle w:val="SubtleReference"/>
+        </w:rPr>
+        <w:t xml:space="preserve">Flatter </w:t>
+      </w:r>
+      <w:r>
+        <w:t>– Gain the King’s Favor and half the Leader’s level in Coins from the Royal Bank.</w:t>
+      </w:r>
+    </w:p>
+    <w:p>
+      <w:pPr>
+        <w:pStyle w:val="ListParagraph"/>
+      </w:pPr>
+      <w:r>
+        <w:rPr>
+          <w:rStyle w:val="SubtleReference"/>
+        </w:rPr>
+        <w:lastRenderedPageBreak/>
+        <w:t xml:space="preserve">Buy </w:t>
+      </w:r>
+      <w:r>
+        <w:t>– Pay 1 Coin per Leader Level and gain Commodities according to the Market Rate.</w:t>
+      </w:r>
+      <w:r>
+        <w:t xml:space="preserve"> Once finished with the trade, decrease the Market Rate.</w:t>
+      </w:r>
+    </w:p>
+    <w:p>
+      <w:pPr>
+        <w:pStyle w:val="ListParagraph"/>
+      </w:pPr>
+      <w:r>
+        <w:t>Ex. At a Market Rate of 4, paying 2 Coins will earn you 8 Commodities. 2 * 4 = 8.</w:t>
+      </w:r>
+    </w:p>
+    <w:p>
+      <w:pPr>
+        <w:pStyle w:val="ListParagraph"/>
+      </w:pPr>
+      <w:r>
+        <w:rPr>
+          <w:rStyle w:val="SubtleReference"/>
+        </w:rPr>
+        <w:t xml:space="preserve">Sell </w:t>
+      </w:r>
+      <w:r>
+        <w:t>– Pay Commodities and gain up to Leader level Coins according to the Market Rate</w:t>
+      </w:r>
+      <w:r>
+        <w:t>, rounded down</w:t>
       </w:r>
       <w:r>
         <w:t>.</w:t>
       </w:r>
-    </w:p>
-    <w:p>
-      <w:pPr>
-        <w:pStyle w:val="ListParagraph"/>
-      </w:pPr>
-      <w:r>
-        <w:rPr>
-          <w:rStyle w:val="SubtleReference"/>
-        </w:rPr>
-        <w:t xml:space="preserve">Build </w:t>
-      </w:r>
-      <w:r>
-        <w:t xml:space="preserve">– Play </w:t>
-      </w:r>
-      <w:r>
-        <w:t>on</w:t>
-      </w:r>
-      <w:r>
-        <w:t xml:space="preserve">e </w:t>
-      </w:r>
-      <w:r>
-        <w:t xml:space="preserve">or more </w:t>
-      </w:r>
-      <w:r>
-        <w:t>Investment</w:t>
-      </w:r>
-      <w:r>
-        <w:t>s</w:t>
-      </w:r>
-      <w:r>
-        <w:t xml:space="preserve"> from your hand to the table, pay </w:t>
-      </w:r>
-      <w:r>
-        <w:t xml:space="preserve">up to </w:t>
-      </w:r>
-      <w:r>
-        <w:t xml:space="preserve">1 Commodity per Leader Level, and </w:t>
-      </w:r>
-      <w:r>
-        <w:t xml:space="preserve">distribute one level per Commodity paid between the </w:t>
-      </w:r>
-      <w:r>
-        <w:t>new Investments.</w:t>
-      </w:r>
-    </w:p>
-    <w:p>
-      <w:pPr>
-        <w:pStyle w:val="ListParagraph"/>
-      </w:pPr>
-      <w:r>
-        <w:lastRenderedPageBreak/>
-        <w:t>There is no limit to the number of Investments a player may have.</w:t>
-      </w:r>
-    </w:p>
-    <w:p>
-      <w:pPr>
-        <w:pStyle w:val="ListParagraph"/>
-      </w:pPr>
-      <w:r>
-        <w:t>The maximum Investment level is either 3 or 6, as shown on the Investment.</w:t>
-      </w:r>
-    </w:p>
-    <w:p>
-      <w:pPr>
-        <w:pStyle w:val="ListParagraph"/>
-      </w:pPr>
-      <w:r>
-        <w:rPr>
-          <w:rStyle w:val="SubtleReference"/>
-        </w:rPr>
-        <w:t>Upgrade</w:t>
-      </w:r>
-      <w:r>
-        <w:rPr>
-          <w:rStyle w:val="SubtleReference"/>
-        </w:rPr>
-        <w:t xml:space="preserve"> </w:t>
-      </w:r>
-      <w:r>
-        <w:t xml:space="preserve">– Pay </w:t>
-      </w:r>
-      <w:r>
-        <w:t xml:space="preserve">up to </w:t>
-      </w:r>
-      <w:r>
-        <w:t xml:space="preserve">1 Commodity </w:t>
-      </w:r>
-      <w:r>
-        <w:t xml:space="preserve">per Leader Level </w:t>
-      </w:r>
-      <w:r>
-        <w:t xml:space="preserve">and </w:t>
-      </w:r>
-      <w:r>
-        <w:t>distribute one level per Commodity paid between your existing Investments</w:t>
-      </w:r>
-      <w:r>
-        <w:t>.</w:t>
-      </w:r>
-    </w:p>
-    <w:p>
-      <w:pPr>
-        <w:pStyle w:val="ListParagraph"/>
-      </w:pPr>
-      <w:r>
-        <w:t xml:space="preserve">The maximum Investment level is either 3 or 6, </w:t>
-      </w:r>
-      <w:r>
-        <w:t xml:space="preserve">as shown </w:t>
-      </w:r>
-      <w:r>
-        <w:t>on the Investment.</w:t>
-      </w:r>
-    </w:p>
-    <w:p>
-      <w:pPr>
-        <w:pStyle w:val="ListParagraph"/>
-      </w:pPr>
-      <w:r>
-        <w:rPr>
-          <w:rStyle w:val="SubtleReference"/>
-        </w:rPr>
-        <w:t xml:space="preserve">Commission </w:t>
-      </w:r>
-      <w:r>
-        <w:t xml:space="preserve">– Immediately gain a new Leader and place it on this action space next to your </w:t>
-      </w:r>
-      <w:r>
-        <w:t xml:space="preserve">existing </w:t>
-      </w:r>
-      <w:r>
-        <w:t xml:space="preserve">Leader. Set the new Leader’s level to half (rounded up) of the </w:t>
-      </w:r>
-      <w:r>
-        <w:t>existing</w:t>
-      </w:r>
-      <w:r>
-        <w:t xml:space="preserve"> Leader’s level.</w:t>
-      </w:r>
-    </w:p>
-    <w:p>
-      <w:pPr>
-        <w:pStyle w:val="ListParagraph"/>
-      </w:pPr>
-      <w:r>
-        <w:t>The maximum number of Leaders a player may have is 10.</w:t>
-      </w:r>
-    </w:p>
-    <w:p>
-      <w:pPr>
-        <w:pStyle w:val="ListParagraph"/>
-      </w:pPr>
-      <w:r>
-        <w:rPr>
-          <w:rStyle w:val="SubtleReference"/>
-        </w:rPr>
-        <w:t xml:space="preserve">Promote </w:t>
-      </w:r>
-      <w:r>
-        <w:t>– Immediately increase your Leader’s Level by 1.</w:t>
-      </w:r>
-    </w:p>
-    <w:p>
-      <w:pPr>
-        <w:pStyle w:val="ListParagraph"/>
-      </w:pPr>
-      <w:r>
-        <w:t xml:space="preserve">The maximum </w:t>
-      </w:r>
-      <w:r>
-        <w:t xml:space="preserve">Leader level </w:t>
-      </w:r>
-      <w:r>
-        <w:t xml:space="preserve">is </w:t>
-      </w:r>
-      <w:r>
-        <w:t>6.</w:t>
-      </w:r>
-    </w:p>
-    <w:p>
-      <w:pPr>
-        <w:pStyle w:val="ListParagraph"/>
-      </w:pPr>
-      <w:r>
-        <w:rPr>
-          <w:rStyle w:val="SubtleReference"/>
-        </w:rPr>
-        <w:t xml:space="preserve">Sue </w:t>
-      </w:r>
-      <w:r>
-        <w:t xml:space="preserve">– Initiate a Trial against another player. The </w:t>
-      </w:r>
-      <w:r>
-        <w:t xml:space="preserve">other </w:t>
-      </w:r>
-      <w:r>
-        <w:t xml:space="preserve">player must immediately place an unused </w:t>
-      </w:r>
-      <w:r>
-        <w:t>L</w:t>
-      </w:r>
-      <w:r>
-        <w:t xml:space="preserve">eader </w:t>
-      </w:r>
-      <w:r>
-        <w:t xml:space="preserve">of their choice </w:t>
-      </w:r>
-      <w:r>
-        <w:t>on this action. The two players then perform a Trial</w:t>
-      </w:r>
-      <w:r>
-        <w:t>, following the instructions in 7.2</w:t>
-      </w:r>
-      <w:r>
-        <w:t>.</w:t>
-      </w:r>
-    </w:p>
-    <w:p>
-      <w:pPr>
-        <w:pStyle w:val="ListParagraph"/>
-      </w:pPr>
-      <w:r>
-        <w:t xml:space="preserve">The other player </w:t>
-      </w:r>
-      <w:r>
-        <w:t>may</w:t>
-      </w:r>
-      <w:r>
-        <w:t xml:space="preserve"> </w:t>
-      </w:r>
-      <w:r>
-        <w:t xml:space="preserve">not </w:t>
-      </w:r>
-      <w:r>
-        <w:t>deny performing this action.</w:t>
-      </w:r>
-    </w:p>
-    <w:p>
-      <w:pPr>
-        <w:pStyle w:val="ListParagraph"/>
-      </w:pPr>
-      <w:r>
-        <w:rPr>
-          <w:rStyle w:val="SubtleReference"/>
-        </w:rPr>
-        <w:t>Negotiate</w:t>
-      </w:r>
-      <w:r>
-        <w:rPr>
-          <w:rStyle w:val="SubtleReference"/>
-        </w:rPr>
-        <w:t xml:space="preserve"> </w:t>
-      </w:r>
-      <w:r>
-        <w:t xml:space="preserve">– </w:t>
-      </w:r>
-      <w:r>
-        <w:t xml:space="preserve">Form an alliance with another player. The other player </w:t>
-      </w:r>
-      <w:r>
-        <w:t>immediately</w:t>
-      </w:r>
-      <w:r>
-        <w:t xml:space="preserve"> places an unused Leader </w:t>
-      </w:r>
-      <w:r>
-        <w:t xml:space="preserve">of their choice </w:t>
-      </w:r>
-      <w:r>
-        <w:t>on this action.</w:t>
-      </w:r>
-      <w:r>
-        <w:t xml:space="preserve"> The two players</w:t>
-      </w:r>
-      <w:r>
-        <w:t xml:space="preserve"> then exchange 1 Alliance Token per Leader level they used.</w:t>
-      </w:r>
-    </w:p>
-    <w:p>
-      <w:pPr>
-        <w:pStyle w:val="ListParagraph"/>
-      </w:pPr>
-      <w:r>
-        <w:t>The other player may d</w:t>
-      </w:r>
-      <w:r>
-        <w:t>e</w:t>
-      </w:r>
-      <w:r>
-        <w:t>ny performing this action. In this case, the first player may choose another player to ally with or take the action back entirely.</w:t>
-      </w:r>
-    </w:p>
-    <w:p>
-      <w:pPr>
-        <w:pStyle w:val="ListParagraph"/>
-      </w:pPr>
-      <w:r>
-        <w:t xml:space="preserve">The two players using this action may only give 1 Alliance Token per Leader level they used. This may result in an uneven exchange </w:t>
-      </w:r>
-      <w:r>
-        <w:t xml:space="preserve">of Alliance Tokens </w:t>
-      </w:r>
-      <w:r>
-        <w:t>if the players used Leaders of unequal levels</w:t>
-      </w:r>
-      <w:r>
-        <w:t>.</w:t>
-      </w:r>
-    </w:p>
-    <w:p>
-      <w:pPr>
-        <w:pStyle w:val="Quote"/>
-      </w:pPr>
-      <w:r>
-        <w:t xml:space="preserve">Persian Fact: </w:t>
-      </w:r>
-      <w:r>
-        <w:t>Satraps handled their p</w:t>
-      </w:r>
-      <w:r>
-        <w:t>rovincial matters independently</w:t>
-      </w:r>
-      <w:r>
-        <w:t>, only involving the King when they needed help</w:t>
-      </w:r>
-      <w:r>
-        <w:t>.</w:t>
-      </w:r>
-    </w:p>
-    <w:p>
-      <w:pPr>
-        <w:pStyle w:val="Heading3"/>
-      </w:pPr>
-      <w:r>
-        <w:t>5.2.2. Undermarket Actions</w:t>
-      </w:r>
-    </w:p>
-    <w:p>
-      <w:r>
-        <w:t xml:space="preserve">These </w:t>
-      </w:r>
-      <w:r>
-        <w:t xml:space="preserve">actions </w:t>
-      </w:r>
-      <w:r>
-        <w:t>represent illicit dealings outside the King’s oversight</w:t>
-      </w:r>
-      <w:r>
-        <w:t xml:space="preserve"> and come with a penalty for use</w:t>
-      </w:r>
-      <w:r>
-        <w:t>. Each may be used once per player per round.</w:t>
-      </w:r>
-    </w:p>
-    <w:p>
-      <w:pPr>
-        <w:pStyle w:val="ListParagraph"/>
-      </w:pPr>
-      <w:r>
-        <w:rPr>
-          <w:rStyle w:val="SubtleReference"/>
-        </w:rPr>
-        <w:t xml:space="preserve">Buy </w:t>
-      </w:r>
-      <w:r>
-        <w:t>– Pay 1 Coin per Leader Level and gain Commodities</w:t>
-      </w:r>
-      <w:r>
-        <w:t xml:space="preserve"> according to the Market Rate</w:t>
-      </w:r>
-      <w:r>
-        <w:t xml:space="preserve"> minus 1</w:t>
-      </w:r>
-      <w:r>
-        <w:t>.</w:t>
-      </w:r>
-      <w:r>
-        <w:t xml:space="preserve"> Once finished with the trade, decrease the Market Rate.</w:t>
-      </w:r>
-    </w:p>
-    <w:p>
-      <w:pPr>
-        <w:pStyle w:val="ListParagraph"/>
-      </w:pPr>
-      <w:r>
-        <w:lastRenderedPageBreak/>
-        <w:t>Ex. At a Market Rate of 4, paying 2 Coins will earn you 6 Commodities. 2 * (4</w:t>
-      </w:r>
-      <w:r>
-        <w:t xml:space="preserve"> </w:t>
-      </w:r>
-      <w:r>
-        <w:t>-</w:t>
-      </w:r>
-      <w:r>
-        <w:t xml:space="preserve"> </w:t>
-      </w:r>
-      <w:r>
-        <w:t>1) = 6</w:t>
-      </w:r>
-      <w:r>
-        <w:t>.</w:t>
-      </w:r>
-    </w:p>
-    <w:p>
-      <w:pPr>
-        <w:pStyle w:val="ListParagraph"/>
-      </w:pPr>
-      <w:r>
-        <w:rPr>
-          <w:rStyle w:val="SubtleReference"/>
-        </w:rPr>
-        <w:t xml:space="preserve">Sell </w:t>
-      </w:r>
-      <w:r>
-        <w:t xml:space="preserve">– Pay Commodities and gain up to Leader </w:t>
-      </w:r>
-      <w:r>
-        <w:t>l</w:t>
-      </w:r>
-      <w:r>
-        <w:t>evel Coins according to the Market Rate plus 1</w:t>
-      </w:r>
-      <w:r>
-        <w:t>, rounded down</w:t>
-      </w:r>
-      <w:r>
-        <w:t>.</w:t>
-      </w:r>
       <w:r>
         <w:t xml:space="preserve"> Once finished with the trade, increase the Market Rate.</w:t>
       </w:r>
@@ -2306,250 +2648,6 @@
         <w:pStyle w:val="ListParagraph"/>
       </w:pPr>
       <w:r>
-        <w:t xml:space="preserve">Ex. At a Market Rate of 4, paying 10 Commodities will earn you 2 Coins. 10 / (4 + 1) </w:t>
-      </w:r>
-      <w:r>
-        <w:t>= 2.</w:t>
-      </w:r>
-    </w:p>
-    <w:p>
-      <w:pPr>
-        <w:pStyle w:val="ListParagraph"/>
-      </w:pPr>
-      <w:r>
-        <w:rPr>
-          <w:rStyle w:val="SubtleReference"/>
-        </w:rPr>
-        <w:t xml:space="preserve">Monetize </w:t>
-      </w:r>
-      <w:r>
-        <w:t xml:space="preserve">– Discard Cards and gain up to Leader </w:t>
-      </w:r>
-      <w:r>
-        <w:t>l</w:t>
-      </w:r>
-      <w:r>
-        <w:t>evel Coins according to 7 minus the Market Rate minus 1</w:t>
-      </w:r>
-      <w:r>
-        <w:t>, rounded down</w:t>
-      </w:r>
-      <w:r>
-        <w:t>.</w:t>
-      </w:r>
-    </w:p>
-    <w:p>
-      <w:pPr>
-        <w:pStyle w:val="ListParagraph"/>
-      </w:pPr>
-      <w:r>
-        <w:t xml:space="preserve">Ex. At a Market Rate of 4, discarding 8 Cards will earn you 2 Coins. 8 / (7 - </w:t>
-      </w:r>
-      <w:r>
-        <w:t>(</w:t>
-      </w:r>
-      <w:r>
-        <w:t xml:space="preserve">4 </w:t>
-      </w:r>
-      <w:r>
-        <w:t>-</w:t>
-      </w:r>
-      <w:r>
-        <w:t xml:space="preserve"> 1)</w:t>
-      </w:r>
-      <w:r>
-        <w:t>)</w:t>
-      </w:r>
-      <w:r>
-        <w:t xml:space="preserve"> = 2.</w:t>
-      </w:r>
-    </w:p>
-    <w:p>
-      <w:pPr>
-        <w:pStyle w:val="ListParagraph"/>
-      </w:pPr>
-      <w:r>
-        <w:rPr>
-          <w:rStyle w:val="SubtleReference"/>
-        </w:rPr>
-        <w:t xml:space="preserve">Donate </w:t>
-      </w:r>
-      <w:r>
-        <w:t>– Pay 1 Coin per Leader level</w:t>
-      </w:r>
-      <w:r>
-        <w:t xml:space="preserve"> to the Royal Bank and gain half (rounded up) the number of donated Coins</w:t>
-      </w:r>
-      <w:r>
-        <w:t xml:space="preserve"> minus 1</w:t>
-      </w:r>
-      <w:r>
-        <w:t xml:space="preserve"> in Honor.</w:t>
-      </w:r>
-    </w:p>
-    <w:p>
-      <w:pPr>
-        <w:pStyle w:val="ListParagraph"/>
-      </w:pPr>
-      <w:r>
-        <w:t>Ex. Donating 3 Coins will earn you 1 Honor. (3 – 1) / 2 = 1.</w:t>
-      </w:r>
-    </w:p>
-    <w:p>
-      <w:pPr>
-        <w:pStyle w:val="Quote"/>
-      </w:pPr>
-      <w:r>
-        <w:t>Imperial Reminder: The King frowns upon Undermarket dealings. Fortunately, frowns are not Laws.</w:t>
-      </w:r>
-    </w:p>
-    <w:p>
-      <w:pPr>
-        <w:pStyle w:val="Heading3"/>
-      </w:pPr>
-      <w:r>
-        <w:t>5.2.3. Court Actions</w:t>
-      </w:r>
-    </w:p>
-    <w:p>
-      <w:r>
-        <w:t xml:space="preserve">These actions represent </w:t>
-      </w:r>
-      <w:r>
-        <w:t xml:space="preserve">direct interactions with </w:t>
-      </w:r>
-      <w:r>
-        <w:t>the King and his Court</w:t>
-      </w:r>
-      <w:r>
-        <w:t>. Each may be used once per round by a single player.</w:t>
-      </w:r>
-    </w:p>
-    <w:p>
-      <w:pPr>
-        <w:pStyle w:val="ListParagraph"/>
-      </w:pPr>
-      <w:r>
-        <w:rPr>
-          <w:rStyle w:val="SubtleReference"/>
-        </w:rPr>
-        <w:t xml:space="preserve">Petition </w:t>
-      </w:r>
-      <w:r>
-        <w:t>– Play 1 Law per Leader level from your hand to the back of the Law Queue.</w:t>
-      </w:r>
-      <w:r>
-        <w:t xml:space="preserve"> Put one of your Card Markers on each Law played.</w:t>
-      </w:r>
-    </w:p>
-    <w:p>
-      <w:pPr>
-        <w:pStyle w:val="ListParagraph"/>
-      </w:pPr>
-      <w:r>
-        <w:rPr>
-          <w:rStyle w:val="SubtleReference"/>
-        </w:rPr>
-        <w:t xml:space="preserve">Postpone </w:t>
-      </w:r>
-      <w:r>
-        <w:t>– Move the Deliberated Law 1 space per Leader level backward in the Law Queue. Immediately make the f</w:t>
-      </w:r>
-      <w:r>
-        <w:t>ir</w:t>
-      </w:r>
-      <w:r>
-        <w:t>st Law in the Queue the new Deliberated Law</w:t>
-      </w:r>
-      <w:r>
-        <w:t xml:space="preserve"> and set its Threshold</w:t>
-      </w:r>
-      <w:r>
-        <w:t>.</w:t>
-      </w:r>
-    </w:p>
-    <w:p>
-      <w:pPr>
-        <w:pStyle w:val="ListParagraph"/>
-      </w:pPr>
-      <w:r>
-        <w:rPr>
-          <w:rStyle w:val="SubtleReference"/>
-        </w:rPr>
-        <w:t xml:space="preserve">Prioritize </w:t>
-      </w:r>
-      <w:r>
-        <w:t>– Move any Law in the Queue, except the Deliberated Law, forward 1 space per Leader Level.</w:t>
-      </w:r>
-    </w:p>
-    <w:p>
-      <w:pPr>
-        <w:pStyle w:val="ListParagraph"/>
-      </w:pPr>
-      <w:r>
-        <w:rPr>
-          <w:rStyle w:val="SubtleReference"/>
-        </w:rPr>
-        <w:t xml:space="preserve">Flatter </w:t>
-      </w:r>
-      <w:r>
-        <w:t>– Gain the King’s Favor and half the Leader’s level in Coins from the Royal Bank.</w:t>
-      </w:r>
-    </w:p>
-    <w:p>
-      <w:pPr>
-        <w:pStyle w:val="ListParagraph"/>
-      </w:pPr>
-      <w:r>
-        <w:rPr>
-          <w:rStyle w:val="SubtleReference"/>
-        </w:rPr>
-        <w:t xml:space="preserve">Buy </w:t>
-      </w:r>
-      <w:r>
-        <w:t>– Pay 1 Coin per Leader Level and gain Commodities according to the Market Rate.</w:t>
-      </w:r>
-      <w:r>
-        <w:t xml:space="preserve"> Once finished with the trade, decrease the Market Rate.</w:t>
-      </w:r>
-    </w:p>
-    <w:p>
-      <w:pPr>
-        <w:pStyle w:val="ListParagraph"/>
-      </w:pPr>
-      <w:r>
-        <w:t>Ex. At a Market Rate of 4, paying 2 Coins will earn you 8 Commodities. 2 * 4 = 8.</w:t>
-      </w:r>
-    </w:p>
-    <w:p>
-      <w:pPr>
-        <w:pStyle w:val="ListParagraph"/>
-      </w:pPr>
-      <w:r>
-        <w:rPr>
-          <w:rStyle w:val="SubtleReference"/>
-        </w:rPr>
-        <w:t xml:space="preserve">Sell </w:t>
-      </w:r>
-      <w:r>
-        <w:t>– Pay Commodities and gain up to Leader level Coins according to the Market Rate</w:t>
-      </w:r>
-      <w:r>
-        <w:t>, rounded down</w:t>
-      </w:r>
-      <w:r>
-        <w:t>.</w:t>
-      </w:r>
-      <w:r>
-        <w:t xml:space="preserve"> Once finished with the trade, increase the Market Rate.</w:t>
-      </w:r>
-    </w:p>
-    <w:p>
-      <w:pPr>
-        <w:pStyle w:val="ListParagraph"/>
-      </w:pPr>
-      <w:r>
-        <w:lastRenderedPageBreak/>
         <w:t>Ex. At a Market Rate of 4, paying 8 Commodities will earn you 2 Coins. 8 / 4 = 2.</w:t>
       </w:r>
     </w:p>
@@ -2723,6 +2821,7 @@
         <w:pStyle w:val="Heading2"/>
       </w:pPr>
       <w:r>
+        <w:lastRenderedPageBreak/>
         <w:t>6.2. Battle</w:t>
       </w:r>
       <w:r>
@@ -2789,199 +2888,199 @@
         <w:pStyle w:val="ListParagraph"/>
       </w:pPr>
       <w:r>
+        <w:t xml:space="preserve">Roll one die per player, halve each </w:t>
+      </w:r>
+      <w:r>
+        <w:t xml:space="preserve">die </w:t>
+      </w:r>
+      <w:r>
+        <w:t xml:space="preserve">(rounded up), and </w:t>
+      </w:r>
+      <w:r>
+        <w:t xml:space="preserve">total </w:t>
+      </w:r>
+      <w:r>
+        <w:t>the results.</w:t>
+      </w:r>
+      <w:r>
+        <w:t xml:space="preserve"> A corresponding number of Greeks are pulled from the Greek Reserves. This new pool represents the size of the </w:t>
+      </w:r>
+      <w:r>
+        <w:t>opposing</w:t>
+      </w:r>
+      <w:r>
+        <w:t xml:space="preserve"> army </w:t>
+      </w:r>
+      <w:r>
+        <w:t xml:space="preserve">deployed </w:t>
+      </w:r>
+      <w:r>
+        <w:t>this round.</w:t>
+      </w:r>
+    </w:p>
+    <w:p>
+      <w:pPr>
+        <w:pStyle w:val="ListParagraph"/>
+      </w:pPr>
+      <w:r>
+        <w:t>Count the number of Troops deployed by each army. The side with the greater number of Troops wins the battle. Discard the defeated army</w:t>
+      </w:r>
+      <w:r>
+        <w:t xml:space="preserve"> and an equal number of Troops from the victorious army. Count </w:t>
+      </w:r>
+      <w:r>
+        <w:t>a battle with equal army sizes as a Persian victory and discard both sides completely.</w:t>
+      </w:r>
+    </w:p>
+    <w:p>
+      <w:pPr>
+        <w:pStyle w:val="ListParagraph"/>
+      </w:pPr>
+      <w:r>
+        <w:t>In case of a Persian victory, discard the remaining Persian Troops and an equal number of Greek Troops from the Greek Reserves. Award each player who deployed Troops in t</w:t>
+      </w:r>
+      <w:r>
+        <w:t>he preceding phase 1 Honor for victory.</w:t>
+      </w:r>
+    </w:p>
+    <w:p>
+      <w:pPr>
+        <w:pStyle w:val="ListParagraph"/>
+      </w:pPr>
+      <w:r>
+        <w:t xml:space="preserve">In case of a Greek victory, give the remaining Greek Troops to the player who deployed the fewest Troops in the preceding phase. In case of a tie, the tied player who deployed last </w:t>
+      </w:r>
+      <w:r>
+        <w:t xml:space="preserve">receives </w:t>
+      </w:r>
+      <w:r>
+        <w:t>the Gree</w:t>
+      </w:r>
+      <w:r>
+        <w:t xml:space="preserve">k Troops. </w:t>
+      </w:r>
+      <w:r>
+        <w:t xml:space="preserve">If multiple players refused to deploy any Troops, the player holding the King’s Favor decides who receives the </w:t>
+      </w:r>
+      <w:r>
+        <w:t>Greek Troops.</w:t>
+      </w:r>
+    </w:p>
+    <w:p>
+      <w:pPr>
+        <w:pStyle w:val="ListParagraph"/>
+      </w:pPr>
+      <w:r>
+        <w:t xml:space="preserve">For each Greek Troop given to </w:t>
+      </w:r>
+      <w:r>
+        <w:t xml:space="preserve">a </w:t>
+      </w:r>
+      <w:r>
+        <w:t>player</w:t>
+      </w:r>
+      <w:r>
+        <w:t xml:space="preserve"> after losing a battle</w:t>
+      </w:r>
+      <w:r>
+        <w:t xml:space="preserve">, </w:t>
+      </w:r>
+      <w:r>
+        <w:t xml:space="preserve">perform the </w:t>
+      </w:r>
+      <w:r>
+        <w:t>corresponding action as a Greek Raid.</w:t>
+      </w:r>
+    </w:p>
+    <w:p>
+      <w:pPr>
+        <w:pStyle w:val="ListParagraph"/>
+      </w:pPr>
+      <w:r>
+        <w:t>If a player has Troops, they discard 1 Troop.</w:t>
+      </w:r>
+    </w:p>
+    <w:p>
+      <w:pPr>
+        <w:pStyle w:val="ListParagraph"/>
+      </w:pPr>
+      <w:r>
+        <w:t>If a player has no Troops but has Investments, they roll a non-player die and downgrade a</w:t>
+      </w:r>
+      <w:r>
+        <w:t xml:space="preserve"> single</w:t>
+      </w:r>
+      <w:r>
+        <w:t xml:space="preserve"> Investment </w:t>
+      </w:r>
+      <w:r>
+        <w:t xml:space="preserve">by </w:t>
+      </w:r>
+      <w:r>
+        <w:t xml:space="preserve">that many levels. The player must </w:t>
+      </w:r>
+      <w:r>
+        <w:t xml:space="preserve">apply the full effects of the die, if possible. Investments </w:t>
+      </w:r>
+      <w:r>
+        <w:t xml:space="preserve">with a </w:t>
+      </w:r>
+      <w:r>
+        <w:t>level lower than 1 are discarded.</w:t>
+      </w:r>
+    </w:p>
+    <w:p>
+      <w:pPr>
+        <w:pStyle w:val="ListParagraph"/>
+      </w:pPr>
+      <w:r>
+        <w:t xml:space="preserve">If a player has no Troops or Investments but has Leaders, they roll a non-player die and </w:t>
+      </w:r>
+      <w:r>
+        <w:t xml:space="preserve">demote </w:t>
+      </w:r>
+      <w:r>
+        <w:t xml:space="preserve">a single Leader by that many levels. The player must apply the full effects of the die, if possible. </w:t>
+      </w:r>
+      <w:r>
+        <w:t xml:space="preserve">Leaders </w:t>
+      </w:r>
+      <w:r>
+        <w:t>with a level lower than 1 are discarded.</w:t>
+      </w:r>
+    </w:p>
+    <w:p>
+      <w:pPr>
+        <w:pStyle w:val="ListParagraph"/>
+      </w:pPr>
+      <w:r>
+        <w:t>If a player has no Troops</w:t>
+      </w:r>
+      <w:r>
+        <w:t xml:space="preserve">, </w:t>
+      </w:r>
+      <w:r>
+        <w:t>Investments</w:t>
+      </w:r>
+      <w:r>
+        <w:t>, or Leaders</w:t>
+      </w:r>
+      <w:r>
+        <w:t>, they are eliminated from the game. Discard all their assets and put all their Coins in the Free Bank</w:t>
+      </w:r>
+      <w:r>
+        <w:t>.</w:t>
+      </w:r>
+      <w:r>
+        <w:t xml:space="preserve"> Discard any remaining raiding Greek Troops.</w:t>
+      </w:r>
+    </w:p>
+    <w:p>
+      <w:pPr>
+        <w:pStyle w:val="Quote"/>
+      </w:pPr>
+      <w:r>
         <w:lastRenderedPageBreak/>
-        <w:t xml:space="preserve">Roll one die per player, halve each </w:t>
-      </w:r>
-      <w:r>
-        <w:t xml:space="preserve">die </w:t>
-      </w:r>
-      <w:r>
-        <w:t xml:space="preserve">(rounded up), and </w:t>
-      </w:r>
-      <w:r>
-        <w:t xml:space="preserve">total </w:t>
-      </w:r>
-      <w:r>
-        <w:t>the results.</w:t>
-      </w:r>
-      <w:r>
-        <w:t xml:space="preserve"> A corresponding number of Greeks are pulled from the Greek Reserves. This new pool represents the size of the </w:t>
-      </w:r>
-      <w:r>
-        <w:t>opposing</w:t>
-      </w:r>
-      <w:r>
-        <w:t xml:space="preserve"> army </w:t>
-      </w:r>
-      <w:r>
-        <w:t xml:space="preserve">deployed </w:t>
-      </w:r>
-      <w:r>
-        <w:t>this round.</w:t>
-      </w:r>
-    </w:p>
-    <w:p>
-      <w:pPr>
-        <w:pStyle w:val="ListParagraph"/>
-      </w:pPr>
-      <w:r>
-        <w:t>Count the number of Troops deployed by each army. The side with the greater number of Troops wins the battle. Discard the defeated army</w:t>
-      </w:r>
-      <w:r>
-        <w:t xml:space="preserve"> and an equal number of Troops from the victorious army. Count </w:t>
-      </w:r>
-      <w:r>
-        <w:t>a battle with equal army sizes as a Persian victory and discard both sides completely.</w:t>
-      </w:r>
-    </w:p>
-    <w:p>
-      <w:pPr>
-        <w:pStyle w:val="ListParagraph"/>
-      </w:pPr>
-      <w:r>
-        <w:t>In case of a Persian victory, discard the remaining Persian Troops and an equal number of Greek Troops from the Greek Reserves. Award each player who deployed Troops in t</w:t>
-      </w:r>
-      <w:r>
-        <w:t>he preceding phase 1 Honor for victory.</w:t>
-      </w:r>
-    </w:p>
-    <w:p>
-      <w:pPr>
-        <w:pStyle w:val="ListParagraph"/>
-      </w:pPr>
-      <w:r>
-        <w:t xml:space="preserve">In case of a Greek victory, give the remaining Greek Troops to the player who deployed the fewest Troops in the preceding phase. In case of a tie, the tied player who deployed last </w:t>
-      </w:r>
-      <w:r>
-        <w:t xml:space="preserve">receives </w:t>
-      </w:r>
-      <w:r>
-        <w:t>the Gree</w:t>
-      </w:r>
-      <w:r>
-        <w:t xml:space="preserve">k Troops. </w:t>
-      </w:r>
-      <w:r>
-        <w:t xml:space="preserve">If multiple players refused to deploy any Troops, the player holding the King’s Favor decides who receives the </w:t>
-      </w:r>
-      <w:r>
-        <w:t>Greek Troops.</w:t>
-      </w:r>
-    </w:p>
-    <w:p>
-      <w:pPr>
-        <w:pStyle w:val="ListParagraph"/>
-      </w:pPr>
-      <w:r>
-        <w:t xml:space="preserve">For each Greek Troop given to </w:t>
-      </w:r>
-      <w:r>
-        <w:t xml:space="preserve">a </w:t>
-      </w:r>
-      <w:r>
-        <w:t>player</w:t>
-      </w:r>
-      <w:r>
-        <w:t xml:space="preserve"> after losing a battle</w:t>
-      </w:r>
-      <w:r>
-        <w:t xml:space="preserve">, </w:t>
-      </w:r>
-      <w:r>
-        <w:t xml:space="preserve">perform the </w:t>
-      </w:r>
-      <w:r>
-        <w:t>corresponding action as a Greek Raid.</w:t>
-      </w:r>
-    </w:p>
-    <w:p>
-      <w:pPr>
-        <w:pStyle w:val="ListParagraph"/>
-      </w:pPr>
-      <w:r>
-        <w:t>If a player has Troops, they discard 1 Troop.</w:t>
-      </w:r>
-    </w:p>
-    <w:p>
-      <w:pPr>
-        <w:pStyle w:val="ListParagraph"/>
-      </w:pPr>
-      <w:r>
-        <w:t>If a player has no Troops but has Investments, they roll a non-player die and downgrade a</w:t>
-      </w:r>
-      <w:r>
-        <w:t xml:space="preserve"> single</w:t>
-      </w:r>
-      <w:r>
-        <w:t xml:space="preserve"> Investment </w:t>
-      </w:r>
-      <w:r>
-        <w:t xml:space="preserve">by </w:t>
-      </w:r>
-      <w:r>
-        <w:t xml:space="preserve">that many levels. The player must </w:t>
-      </w:r>
-      <w:r>
-        <w:t xml:space="preserve">apply the full effects of the die, if possible. Investments </w:t>
-      </w:r>
-      <w:r>
-        <w:t xml:space="preserve">with a </w:t>
-      </w:r>
-      <w:r>
-        <w:t>level lower than 1 are discarded.</w:t>
-      </w:r>
-    </w:p>
-    <w:p>
-      <w:pPr>
-        <w:pStyle w:val="ListParagraph"/>
-      </w:pPr>
-      <w:r>
-        <w:t xml:space="preserve">If a player has no Troops or Investments but has Leaders, they roll a non-player die and </w:t>
-      </w:r>
-      <w:r>
-        <w:t xml:space="preserve">demote </w:t>
-      </w:r>
-      <w:r>
-        <w:t xml:space="preserve">a single Leader by that many levels. The player must apply the full effects of the die, if possible. </w:t>
-      </w:r>
-      <w:r>
-        <w:t xml:space="preserve">Leaders </w:t>
-      </w:r>
-      <w:r>
-        <w:t>with a level lower than 1 are discarded.</w:t>
-      </w:r>
-    </w:p>
-    <w:p>
-      <w:pPr>
-        <w:pStyle w:val="ListParagraph"/>
-      </w:pPr>
-      <w:r>
-        <w:t>If a player has no Troops</w:t>
-      </w:r>
-      <w:r>
-        <w:t xml:space="preserve">, </w:t>
-      </w:r>
-      <w:r>
-        <w:t>Investments</w:t>
-      </w:r>
-      <w:r>
-        <w:t>, or Leaders</w:t>
-      </w:r>
-      <w:r>
-        <w:t>, they are eliminated from the game. Discard all their assets and put all their Coins in the Free Bank</w:t>
-      </w:r>
-      <w:r>
-        <w:t>.</w:t>
-      </w:r>
-      <w:r>
-        <w:t xml:space="preserve"> Discard any remaining raiding Greek Troops.</w:t>
-      </w:r>
-    </w:p>
-    <w:p>
-      <w:pPr>
-        <w:pStyle w:val="Quote"/>
-      </w:pPr>
-      <w:r>
         <w:t xml:space="preserve">Persian Fact: Greek hoplites were famously disciplined. Persian </w:t>
       </w:r>
       <w:r>
@@ -3028,7 +3127,6 @@
         <w:pStyle w:val="Heading2"/>
       </w:pPr>
       <w:r>
-        <w:lastRenderedPageBreak/>
         <w:t>6.4. Resolve Schemes</w:t>
       </w:r>
     </w:p>
@@ -3223,7 +3321,13 @@
         <w:pStyle w:val="ListParagraph"/>
       </w:pPr>
       <w:r>
-        <w:t xml:space="preserve">Move the Deliberated Law with its current Threshold to the </w:t>
+        <w:t xml:space="preserve">Move the Deliberated Law with its current Threshold </w:t>
+      </w:r>
+      <w:r>
+        <w:t xml:space="preserve">and Law Tag </w:t>
+      </w:r>
+      <w:r>
+        <w:t xml:space="preserve">to the </w:t>
       </w:r>
       <w:r>
         <w:t>Codex</w:t>
@@ -3249,15 +3353,40 @@
         <w:t xml:space="preserve">, </w:t>
       </w:r>
       <w:r>
-        <w:t>discard the old Edict.</w:t>
-      </w:r>
-    </w:p>
-    <w:p>
-      <w:pPr>
-        <w:pStyle w:val="ListParagraph"/>
-      </w:pPr>
-      <w:r>
-        <w:t>If the new Edict changes the Threshold of an existing Edict, change the existing Edict to have the Threshold and sponsor of the new Edict. Then, discard the new Edict.</w:t>
+        <w:t>discard the old Edict</w:t>
+      </w:r>
+      <w:r>
+        <w:t xml:space="preserve"> with its Threshold and Law Tags</w:t>
+      </w:r>
+      <w:r>
+        <w:t>.</w:t>
+      </w:r>
+    </w:p>
+    <w:p>
+      <w:pPr>
+        <w:pStyle w:val="ListParagraph"/>
+      </w:pPr>
+      <w:r>
+        <w:lastRenderedPageBreak/>
+        <w:t>If the new Edict changes the Threshold of an existing Edict, change the existing Edict to have the Threshold</w:t>
+      </w:r>
+      <w:r>
+        <w:t xml:space="preserve">, </w:t>
+      </w:r>
+      <w:r>
+        <w:t>sponsor</w:t>
+      </w:r>
+      <w:r>
+        <w:t>, and Law Tag</w:t>
+      </w:r>
+      <w:r>
+        <w:t xml:space="preserve"> of the new Edict. Then, discard the new Edict</w:t>
+      </w:r>
+      <w:r>
+        <w:t xml:space="preserve"> and the old Law Tags</w:t>
+      </w:r>
+      <w:r>
+        <w:t>.</w:t>
       </w:r>
     </w:p>
     <w:p>
@@ -3293,80 +3422,8 @@
       <w:r>
         <w:t>If the Law Queue is empty, draw a Law from the top of the Law deck and randomly set its Threshold. This new Law has no sponsor.</w:t>
       </w:r>
-    </w:p>
-    <w:p>
-      <w:pPr>
-        <w:pStyle w:val="Heading2"/>
-      </w:pPr>
-      <w:r>
-        <w:lastRenderedPageBreak/>
-        <w:t>6.</w:t>
-      </w:r>
-      <w:r>
-        <w:t>7</w:t>
-      </w:r>
-      <w:r>
-        <w:t>. Economic Reallocation</w:t>
-      </w:r>
-    </w:p>
-    <w:p>
-      <w:r>
-        <w:t xml:space="preserve">The King has many financial interests, some of which lie in the </w:t>
-      </w:r>
-      <w:r>
-        <w:t>province</w:t>
-      </w:r>
-      <w:r>
-        <w:t xml:space="preserve">s of players and many of which do not. Every round, the King </w:t>
-      </w:r>
-      <w:r>
-        <w:t xml:space="preserve">generously </w:t>
-      </w:r>
-      <w:r>
-        <w:t>make</w:t>
-      </w:r>
-      <w:r>
-        <w:t>s</w:t>
-      </w:r>
-      <w:r>
-        <w:t xml:space="preserve"> </w:t>
-      </w:r>
-      <w:r>
-        <w:t xml:space="preserve">a portion of </w:t>
-      </w:r>
-      <w:r>
-        <w:t xml:space="preserve">his </w:t>
-      </w:r>
-      <w:r>
-        <w:t xml:space="preserve">wealth </w:t>
-      </w:r>
-      <w:r>
-        <w:t xml:space="preserve">available </w:t>
-      </w:r>
-      <w:r>
-        <w:t>to your small provinces</w:t>
-      </w:r>
-      <w:r>
-        <w:t>, at great cost to himself.</w:t>
-      </w:r>
-    </w:p>
-    <w:p>
-      <w:pPr>
-        <w:pStyle w:val="ListParagraph"/>
-      </w:pPr>
-      <w:r>
-        <w:t>Add 1 Coin per player to the Royal Bank from the Free Bank.</w:t>
-      </w:r>
-    </w:p>
-    <w:p>
-      <w:pPr>
-        <w:pStyle w:val="ListParagraph"/>
-      </w:pPr>
-      <w:r>
-        <w:t>Adjust the Market Rate by rolling a non-player die then performing the corresponding action</w:t>
-      </w:r>
-      <w:r>
-        <w:t xml:space="preserve"> based on the result.</w:t>
+      <w:r>
+        <w:t xml:space="preserve"> Peform the following steps to choose a sanctioned action.</w:t>
       </w:r>
     </w:p>
     <w:p>
@@ -3378,7 +3435,64 @@
         </w:numPr>
       </w:pPr>
       <w:r>
-        <w:t>If the result is higher than the Market Rate, increase the Market Rate by 1.</w:t>
+        <w:t>R</w:t>
+      </w:r>
+      <w:r>
+        <w:t>oll a non-Player die until a result of 1-3 is shown.</w:t>
+      </w:r>
+    </w:p>
+    <w:p>
+      <w:pPr>
+        <w:pStyle w:val="ListParagraph"/>
+        <w:numPr>
+          <w:ilvl w:val="2"/>
+          <w:numId w:val="3"/>
+        </w:numPr>
+      </w:pPr>
+      <w:r>
+        <w:t>For a result of 1, a Provincial action will be sanctioned.</w:t>
+      </w:r>
+      <w:r>
+        <w:t xml:space="preserve"> Roll the non-player die again until a result of 1-3 is shown. </w:t>
+      </w:r>
+      <w:r>
+        <w:t>An action in the corresponding row (</w:t>
+      </w:r>
+      <w:r>
+        <w:t>1 is top, 2 is middle, 3 is bottom</w:t>
+      </w:r>
+      <w:r>
+        <w:t>)</w:t>
+      </w:r>
+      <w:r>
+        <w:t xml:space="preserve"> will be sanctioned.</w:t>
+      </w:r>
+    </w:p>
+    <w:p>
+      <w:pPr>
+        <w:pStyle w:val="ListParagraph"/>
+        <w:numPr>
+          <w:ilvl w:val="2"/>
+          <w:numId w:val="3"/>
+        </w:numPr>
+      </w:pPr>
+      <w:r>
+        <w:t>For a result of 2, an Undermarket action will be sanctioned.</w:t>
+      </w:r>
+    </w:p>
+    <w:p>
+      <w:pPr>
+        <w:pStyle w:val="ListParagraph"/>
+        <w:numPr>
+          <w:ilvl w:val="2"/>
+          <w:numId w:val="3"/>
+        </w:numPr>
+      </w:pPr>
+      <w:r>
+        <w:t>For a result of 3, a Court action will be sanctioned.</w:t>
+      </w:r>
+      <w:r>
+        <w:t xml:space="preserve"> Roll the non-player die again until a result of 1 or 2 is shown. An action in the corresponding row (1 is top, 2 is bottom) will be sanctioned.</w:t>
       </w:r>
     </w:p>
     <w:p>
@@ -3390,7 +3504,22 @@
         </w:numPr>
       </w:pPr>
       <w:r>
-        <w:t>If the result is equal to the Market Rate, leave the Market Rate as it is.</w:t>
+        <w:t xml:space="preserve">Roll </w:t>
+      </w:r>
+      <w:r>
+        <w:t xml:space="preserve">the non-Player die again </w:t>
+      </w:r>
+      <w:r>
+        <w:t xml:space="preserve">until </w:t>
+      </w:r>
+      <w:r>
+        <w:t>a result of 1-4 is shown.</w:t>
+      </w:r>
+      <w:r>
+        <w:t xml:space="preserve"> The action in the corresponding column (1 is far left, 4 is far right) will be sanctioned. Place a Law Tag on the chosen action and on the </w:t>
+      </w:r>
+      <w:r>
+        <w:t>new Law.</w:t>
       </w:r>
     </w:p>
     <w:p>
@@ -3402,6 +3531,153 @@
         </w:numPr>
       </w:pPr>
       <w:r>
+        <w:t xml:space="preserve">Ex. Rolls of </w:t>
+      </w:r>
+      <w:r>
+        <w:t xml:space="preserve">3, 2, and </w:t>
+      </w:r>
+      <w:r>
+        <w:t>4 will sanction Flatter.</w:t>
+      </w:r>
+    </w:p>
+    <w:p>
+      <w:pPr>
+        <w:pStyle w:val="ListParagraph"/>
+        <w:numPr>
+          <w:ilvl w:val="1"/>
+          <w:numId w:val="3"/>
+        </w:numPr>
+      </w:pPr>
+      <w:r>
+        <w:t xml:space="preserve">Ex. Rolls of 1, 1, and 2 will sanction </w:t>
+      </w:r>
+      <w:r>
+        <w:t>Brainstorm.</w:t>
+      </w:r>
+    </w:p>
+    <w:p>
+      <w:pPr>
+        <w:pStyle w:val="ListParagraph"/>
+        <w:numPr>
+          <w:ilvl w:val="1"/>
+          <w:numId w:val="3"/>
+        </w:numPr>
+      </w:pPr>
+      <w:r>
+        <w:t xml:space="preserve">Ex. Rolls of </w:t>
+      </w:r>
+      <w:r>
+        <w:t>2 and 1 will sanction Undermarket Buy.</w:t>
+      </w:r>
+    </w:p>
+    <w:p>
+      <w:pPr>
+        <w:pStyle w:val="Heading2"/>
+      </w:pPr>
+      <w:r>
+        <w:t>6.</w:t>
+      </w:r>
+      <w:r>
+        <w:t>7</w:t>
+      </w:r>
+      <w:r>
+        <w:t>. Economic Reallocation</w:t>
+      </w:r>
+    </w:p>
+    <w:p>
+      <w:r>
+        <w:t xml:space="preserve">The King has many financial interests, some of which lie in the </w:t>
+      </w:r>
+      <w:r>
+        <w:t>province</w:t>
+      </w:r>
+      <w:r>
+        <w:t xml:space="preserve">s of players and many of which do not. Every round, the King </w:t>
+      </w:r>
+      <w:r>
+        <w:t xml:space="preserve">generously </w:t>
+      </w:r>
+      <w:r>
+        <w:t>make</w:t>
+      </w:r>
+      <w:r>
+        <w:t>s</w:t>
+      </w:r>
+      <w:r>
+        <w:t xml:space="preserve"> </w:t>
+      </w:r>
+      <w:r>
+        <w:t xml:space="preserve">a portion of </w:t>
+      </w:r>
+      <w:r>
+        <w:t xml:space="preserve">his </w:t>
+      </w:r>
+      <w:r>
+        <w:t xml:space="preserve">wealth </w:t>
+      </w:r>
+      <w:r>
+        <w:t xml:space="preserve">available </w:t>
+      </w:r>
+      <w:r>
+        <w:t>to your small provinces</w:t>
+      </w:r>
+      <w:r>
+        <w:t>, at great cost to himself.</w:t>
+      </w:r>
+    </w:p>
+    <w:p>
+      <w:pPr>
+        <w:pStyle w:val="ListParagraph"/>
+      </w:pPr>
+      <w:r>
+        <w:t>Add 1 Coin per player to the Royal Bank from the Free Bank.</w:t>
+      </w:r>
+    </w:p>
+    <w:p>
+      <w:pPr>
+        <w:pStyle w:val="ListParagraph"/>
+      </w:pPr>
+      <w:r>
+        <w:t>Adjust the Market Rate by rolling a non-player die then performing the corresponding action</w:t>
+      </w:r>
+      <w:r>
+        <w:t xml:space="preserve"> based on the result.</w:t>
+      </w:r>
+    </w:p>
+    <w:p>
+      <w:pPr>
+        <w:pStyle w:val="ListParagraph"/>
+        <w:numPr>
+          <w:ilvl w:val="1"/>
+          <w:numId w:val="3"/>
+        </w:numPr>
+      </w:pPr>
+      <w:r>
+        <w:t>If the result is higher than the Market Rate, increase the Market Rate by 1.</w:t>
+      </w:r>
+    </w:p>
+    <w:p>
+      <w:pPr>
+        <w:pStyle w:val="ListParagraph"/>
+        <w:numPr>
+          <w:ilvl w:val="1"/>
+          <w:numId w:val="3"/>
+        </w:numPr>
+      </w:pPr>
+      <w:r>
+        <w:lastRenderedPageBreak/>
+        <w:t>If the result is equal to the Market Rate, leave the Market Rate as it is.</w:t>
+      </w:r>
+    </w:p>
+    <w:p>
+      <w:pPr>
+        <w:pStyle w:val="ListParagraph"/>
+        <w:numPr>
+          <w:ilvl w:val="1"/>
+          <w:numId w:val="3"/>
+        </w:numPr>
+      </w:pPr>
+      <w:r>
         <w:t>If the result is lower than the Ma</w:t>
       </w:r>
       <w:r>
@@ -3531,58 +3807,124 @@
         <w:pStyle w:val="Heading4"/>
       </w:pPr>
       <w:r>
+        <w:t>7.1.2.1</w:t>
+      </w:r>
+      <w:r>
+        <w:t>.</w:t>
+      </w:r>
+      <w:r>
+        <w:t xml:space="preserve"> Buy</w:t>
+      </w:r>
+      <w:r>
+        <w:t xml:space="preserve"> Action</w:t>
+      </w:r>
+    </w:p>
+    <w:p>
+      <w:r>
+        <w:t xml:space="preserve">When players buy Commodities, the Market Rate determines the number of Commodities they will gain in exchange for a single Coin. </w:t>
+      </w:r>
+      <w:r>
+        <w:t xml:space="preserve">This rate may be affected </w:t>
+      </w:r>
+      <w:r>
+        <w:t xml:space="preserve">first </w:t>
+      </w:r>
+      <w:r>
+        <w:t xml:space="preserve">by the type of action (Court/Undermarket) and </w:t>
+      </w:r>
+      <w:r>
+        <w:t xml:space="preserve">then </w:t>
+      </w:r>
+      <w:r>
+        <w:t>by the player’s Investments</w:t>
+      </w:r>
+      <w:r>
+        <w:t>.</w:t>
+      </w:r>
+      <w:r>
+        <w:t xml:space="preserve"> After performing the trade, the Market Rate decreases, reflecting the </w:t>
+      </w:r>
+      <w:r>
+        <w:t>decreased s</w:t>
+      </w:r>
+      <w:r>
+        <w:t xml:space="preserve">upply of </w:t>
+      </w:r>
+      <w:r>
+        <w:t>Commodities in the market</w:t>
+      </w:r>
+      <w:r>
+        <w:t xml:space="preserve"> and a corresponding increase in their value</w:t>
+      </w:r>
+      <w:r>
+        <w:t>.</w:t>
+      </w:r>
+    </w:p>
+    <w:p>
+      <w:pPr>
+        <w:pStyle w:val="Heading4"/>
+      </w:pPr>
+      <w:r>
+        <w:t>7.1.2.2</w:t>
+      </w:r>
+      <w:r>
+        <w:t>.</w:t>
+      </w:r>
+      <w:r>
+        <w:t xml:space="preserve"> Sell</w:t>
+      </w:r>
+      <w:r>
+        <w:t xml:space="preserve"> Action</w:t>
+      </w:r>
+    </w:p>
+    <w:p>
+      <w:r>
+        <w:t xml:space="preserve">When players sell Commodities, the Market Rate determines the number of Commodities they must discard to gain a single Coin. This rate may be affected first by the type of action (Court/Undermarket) and then by the player’s Investments. After performing </w:t>
+      </w:r>
+      <w:r>
         <w:lastRenderedPageBreak/>
-        <w:t>7.1.2.1</w:t>
+        <w:t>the trade, the Market Rate increases, reflecting the increased supply of Commodities in the market and a corresponding decrease in their value.</w:t>
+      </w:r>
+    </w:p>
+    <w:p>
+      <w:pPr>
+        <w:pStyle w:val="Heading4"/>
+      </w:pPr>
+      <w:r>
+        <w:t>7.1.2.3</w:t>
       </w:r>
       <w:r>
         <w:t>.</w:t>
       </w:r>
       <w:r>
-        <w:t xml:space="preserve"> Buy</w:t>
-      </w:r>
-      <w:r>
-        <w:t xml:space="preserve"> Action</w:t>
-      </w:r>
-    </w:p>
-    <w:p>
-      <w:r>
-        <w:t xml:space="preserve">When players buy Commodities, the Market Rate determines the number of Commodities they will gain in exchange for a single Coin. </w:t>
-      </w:r>
-      <w:r>
-        <w:t xml:space="preserve">This rate may be affected </w:t>
-      </w:r>
-      <w:r>
-        <w:t xml:space="preserve">first </w:t>
-      </w:r>
-      <w:r>
-        <w:t xml:space="preserve">by the type of action (Court/Undermarket) and </w:t>
-      </w:r>
-      <w:r>
-        <w:t xml:space="preserve">then </w:t>
-      </w:r>
-      <w:r>
-        <w:t>by the player’s Investments</w:t>
-      </w:r>
-      <w:r>
-        <w:t>.</w:t>
-      </w:r>
-      <w:r>
-        <w:t xml:space="preserve"> After performing the trade, the Market Rate decreases, reflecting the </w:t>
-      </w:r>
-      <w:r>
-        <w:t>decreased s</w:t>
-      </w:r>
-      <w:r>
-        <w:t xml:space="preserve">upply of </w:t>
-      </w:r>
-      <w:r>
-        <w:t>Commodities in the market</w:t>
-      </w:r>
-      <w:r>
-        <w:t xml:space="preserve"> and a corresponding increase in their value</w:t>
-      </w:r>
-      <w:r>
-        <w:t>.</w:t>
+        <w:t xml:space="preserve"> Economic Reallocation during the Reports Phase</w:t>
+      </w:r>
+    </w:p>
+    <w:p>
+      <w:r>
+        <w:t>At the end of every round, the Market Rate changes randomly to reflect the impact of the players on the general econom</w:t>
+      </w:r>
+      <w:r>
+        <w:t>y</w:t>
+      </w:r>
+      <w:r>
+        <w:t xml:space="preserve"> of the Empire and vice versa. </w:t>
+      </w:r>
+      <w:r>
+        <w:t>See 6.8 for details on performing this change.</w:t>
+      </w:r>
+    </w:p>
+    <w:p>
+      <w:pPr>
+        <w:pStyle w:val="Heading3"/>
+      </w:pPr>
+      <w:r>
+        <w:t>7.1.3. Other Effects of the Market Rate</w:t>
+      </w:r>
+    </w:p>
+    <w:p>
+      <w:r>
+        <w:t>The Market Rate also plays a role in the following situations:</w:t>
       </w:r>
     </w:p>
     <w:p>
@@ -3590,21 +3932,18 @@
         <w:pStyle w:val="Heading4"/>
       </w:pPr>
       <w:r>
-        <w:t>7.1.2.2</w:t>
-      </w:r>
-      <w:r>
-        <w:t>.</w:t>
-      </w:r>
-      <w:r>
-        <w:t xml:space="preserve"> Sell</w:t>
-      </w:r>
-      <w:r>
-        <w:t xml:space="preserve"> Action</w:t>
-      </w:r>
-    </w:p>
-    <w:p>
-      <w:r>
-        <w:t>When players sell Commodities, the Market Rate determines the number of Commodities they must discard to gain a single Coin. This rate may be affected first by the type of action (Court/Undermarket) and then by the player’s Investments. After performing the trade, the Market Rate increases, reflecting the increased supply of Commodities in the market and a corresponding decrease in their value.</w:t>
+        <w:t>7.1.3.1.</w:t>
+      </w:r>
+      <w:r>
+        <w:t xml:space="preserve"> Monetize Action</w:t>
+      </w:r>
+    </w:p>
+    <w:p>
+      <w:r>
+        <w:t xml:space="preserve">When players sell Cards (ideas) from their hand, the Market Rate determines the number of Cards they must discard to gain a single Coin. This rate may be affected first by the type of action (Court/Undermarket) and then by the player’s Investments. </w:t>
+      </w:r>
+      <w:r>
+        <w:t>This trade does not influence the Market Rate since the sale of ideas does not necessitate a change in the availability of physical assets.</w:t>
       </w:r>
     </w:p>
     <w:p>
@@ -3612,27 +3951,73 @@
         <w:pStyle w:val="Heading4"/>
       </w:pPr>
       <w:r>
-        <w:t>7.1.2.3</w:t>
-      </w:r>
-      <w:r>
-        <w:t>.</w:t>
-      </w:r>
-      <w:r>
-        <w:t xml:space="preserve"> Economic Reallocation during the Reports Phase</w:t>
-      </w:r>
-    </w:p>
-    <w:p>
-      <w:r>
-        <w:t>At the end of every round, the Market Rate changes randomly to reflect the impact of the players on the general econom</w:t>
-      </w:r>
-      <w:r>
-        <w:t>y</w:t>
-      </w:r>
-      <w:r>
-        <w:t xml:space="preserve"> of the Empire and vice versa. </w:t>
-      </w:r>
-      <w:r>
-        <w:t>See 6.8 for details on performing this change.</w:t>
+        <w:t>7.1.3.2. Emergency Trades</w:t>
+      </w:r>
+    </w:p>
+    <w:p>
+      <w:r>
+        <w:rPr>
+          <w:rStyle w:val="SubtleReference"/>
+        </w:rPr>
+        <w:t>Emergency Trades</w:t>
+      </w:r>
+      <w:r>
+        <w:t xml:space="preserve"> represent the generosity of the King to ensure his subjects have the ability to respond appropriately to </w:t>
+      </w:r>
+      <w:r>
+        <w:t>unforeseen</w:t>
+      </w:r>
+      <w:r>
+        <w:t xml:space="preserve"> issue</w:t>
+      </w:r>
+      <w:r>
+        <w:t xml:space="preserve">s. </w:t>
+      </w:r>
+      <w:r>
+        <w:t xml:space="preserve">When a player is required to pay Coins for a Tax or </w:t>
+      </w:r>
+      <w:r>
+        <w:t>Trial,</w:t>
+      </w:r>
+      <w:r>
+        <w:t xml:space="preserve"> but the player does not have enough Coins to pay the full cost, the player may </w:t>
+      </w:r>
+      <w:r>
+        <w:t>immediately discard Commodities or Cards to gain Coins and pay their remaining fee. When making an Emergency</w:t>
+      </w:r>
+      <w:r>
+        <w:t xml:space="preserve"> Trade, the player may not apply any effects provided by Investments to alter the Market Rate.</w:t>
+      </w:r>
+      <w:r>
+        <w:t xml:space="preserve"> The player then follows the normal procedure for Selling or </w:t>
+      </w:r>
+      <w:r>
+        <w:t>Monetizing</w:t>
+      </w:r>
+      <w:r>
+        <w:t xml:space="preserve">, depending on which resource they choose to discard. </w:t>
+      </w:r>
+      <w:r>
+        <w:t>The player takes any Coins gained from the Free Bank and immediately uses them to pay the fee.</w:t>
+      </w:r>
+    </w:p>
+    <w:p>
+      <w:r>
+        <w:t xml:space="preserve">If a player cannot trade enough Commodities and Cards to pay their fee, all previous Emergency Trades they performed </w:t>
+      </w:r>
+      <w:r>
+        <w:t xml:space="preserve">for this payment </w:t>
+      </w:r>
+      <w:r>
+        <w:t xml:space="preserve">are reversed, and </w:t>
+      </w:r>
+      <w:r>
+        <w:t>they immediately lose 1 Honor for the shame of having no money.</w:t>
+      </w:r>
+    </w:p>
+    <w:p>
+      <w:r>
+        <w:t>Emergency Trades do not influence the Market Rate since they are unplanned and commonly involve fewer resources.</w:t>
       </w:r>
     </w:p>
     <w:p>
@@ -3640,132 +4025,26 @@
         <w:pStyle w:val="Heading3"/>
       </w:pPr>
       <w:r>
-        <w:t>7.1.3. Other Effects of the Market Rate</w:t>
-      </w:r>
-    </w:p>
-    <w:p>
-      <w:r>
-        <w:t>The Market Rate also plays a role in the following situations:</w:t>
-      </w:r>
-    </w:p>
-    <w:p>
-      <w:pPr>
-        <w:pStyle w:val="Heading4"/>
-      </w:pPr>
-      <w:r>
-        <w:t>7.1.3.1.</w:t>
-      </w:r>
-      <w:r>
-        <w:t xml:space="preserve"> Monetize Action</w:t>
-      </w:r>
-    </w:p>
-    <w:p>
-      <w:r>
-        <w:t xml:space="preserve">When players sell Cards (ideas) from their hand, the Market Rate determines the number of Cards they must discard to gain a single Coin. This rate may be affected first by the type of action (Court/Undermarket) and then by the player’s Investments. </w:t>
-      </w:r>
-      <w:r>
-        <w:t>This trade does not influence the Market Rate since the sale of ideas does not necessitate a change in the availability of physical assets.</w:t>
-      </w:r>
-    </w:p>
-    <w:p>
-      <w:pPr>
-        <w:pStyle w:val="Heading4"/>
-      </w:pPr>
-      <w:r>
-        <w:t>7.1.3.2. Emergency Trades</w:t>
-      </w:r>
-    </w:p>
-    <w:p>
-      <w:r>
-        <w:rPr>
-          <w:rStyle w:val="SubtleReference"/>
-        </w:rPr>
-        <w:t>Emergency Trades</w:t>
-      </w:r>
-      <w:r>
-        <w:t xml:space="preserve"> represent the generosity of the King to ensure his subjects have the ability to respond appropriately to </w:t>
-      </w:r>
-      <w:r>
-        <w:t>unforeseen</w:t>
-      </w:r>
-      <w:r>
-        <w:t xml:space="preserve"> issue</w:t>
-      </w:r>
-      <w:r>
-        <w:t xml:space="preserve">s. </w:t>
-      </w:r>
-      <w:r>
-        <w:t xml:space="preserve">When a player is required to pay Coins for a Tax or </w:t>
-      </w:r>
-      <w:r>
-        <w:t>Trial,</w:t>
-      </w:r>
-      <w:r>
-        <w:t xml:space="preserve"> but the player does not have enough Coins to pay the full cost, the player may </w:t>
-      </w:r>
-      <w:r>
-        <w:t>immediately discard Commodities or Cards to gain Coins and pay their remaining fee. When making an Emergency</w:t>
-      </w:r>
-      <w:r>
-        <w:t xml:space="preserve"> Trade, the player may not apply any effects provided by Investments to alter the Market Rate.</w:t>
-      </w:r>
-      <w:r>
-        <w:t xml:space="preserve"> The player then follows the normal procedure for Selling or </w:t>
-      </w:r>
-      <w:r>
-        <w:t>Monetizing</w:t>
-      </w:r>
-      <w:r>
-        <w:t xml:space="preserve">, depending on which resource they choose to discard. </w:t>
-      </w:r>
-      <w:r>
-        <w:t>The player takes any Coins gained from the Free Bank and immediately uses them to pay the fee.</w:t>
-      </w:r>
-    </w:p>
-    <w:p>
+        <w:t>7.1.3. Resource Limitations</w:t>
+      </w:r>
+    </w:p>
+    <w:p>
+      <w:r>
+        <w:t xml:space="preserve">For the purposes of the game, the Royal Bank is the only resource considered to have limited funds. Coins in the Free Bank </w:t>
+      </w:r>
+      <w:r>
+        <w:t xml:space="preserve">and Commodities </w:t>
+      </w:r>
+      <w:r>
+        <w:t>are infinitely available.</w:t>
+      </w:r>
+    </w:p>
+    <w:p>
+      <w:pPr>
+        <w:pStyle w:val="Heading2"/>
+      </w:pPr>
       <w:r>
         <w:lastRenderedPageBreak/>
-        <w:t xml:space="preserve">If a player cannot trade enough Commodities and Cards to pay their fee, all previous Emergency Trades they performed </w:t>
-      </w:r>
-      <w:r>
-        <w:t xml:space="preserve">for this payment </w:t>
-      </w:r>
-      <w:r>
-        <w:t xml:space="preserve">are reversed, and </w:t>
-      </w:r>
-      <w:r>
-        <w:t>they immediately lose 1 Honor for the shame of having no money.</w:t>
-      </w:r>
-    </w:p>
-    <w:p>
-      <w:r>
-        <w:t>Emergency Trades do not influence the Market Rate since they are unplanned and commonly involve fewer resources.</w:t>
-      </w:r>
-    </w:p>
-    <w:p>
-      <w:pPr>
-        <w:pStyle w:val="Heading3"/>
-      </w:pPr>
-      <w:r>
-        <w:t>7.1.3. Resource Limitations</w:t>
-      </w:r>
-    </w:p>
-    <w:p>
-      <w:r>
-        <w:t xml:space="preserve">For the purposes of the game, the Royal Bank is the only resource considered to have limited funds. Coins in the Free Bank </w:t>
-      </w:r>
-      <w:r>
-        <w:t xml:space="preserve">and Commodities </w:t>
-      </w:r>
-      <w:r>
-        <w:t>are infinitely available.</w:t>
-      </w:r>
-    </w:p>
-    <w:p>
-      <w:pPr>
-        <w:pStyle w:val="Heading2"/>
-      </w:pPr>
-      <w:r>
         <w:t xml:space="preserve">7.2. </w:t>
       </w:r>
       <w:r>
@@ -3968,7 +4247,6 @@
         </w:numPr>
       </w:pPr>
       <w:r>
-        <w:lastRenderedPageBreak/>
         <w:t>“My advisors are loyal</w:t>
       </w:r>
       <w:r>
@@ -4038,7 +4316,11 @@
         <w:t>.</w:t>
       </w:r>
       <w:r>
-        <w:t xml:space="preserve"> After seeing the level of the Prosecutor's leader, t</w:t>
+        <w:t xml:space="preserve"> After seeing the </w:t>
+      </w:r>
+      <w:r>
+        <w:lastRenderedPageBreak/>
+        <w:t>level of the Prosecutor's leader, t</w:t>
       </w:r>
       <w:r>
         <w:t>he Defendant must then do the same</w:t>
@@ -4267,7 +4549,6 @@
         <w:pStyle w:val="Heading2"/>
       </w:pPr>
       <w:r>
-        <w:lastRenderedPageBreak/>
         <w:t xml:space="preserve">7.3. </w:t>
       </w:r>
       <w:r>
@@ -4330,6 +4611,7 @@
         </w:rPr>
       </w:pPr>
       <w:r>
+        <w:lastRenderedPageBreak/>
         <w:t>7.3</w:t>
       </w:r>
       <w:r>
@@ -4616,7 +4898,6 @@
         </w:numPr>
       </w:pPr>
       <w:r>
-        <w:lastRenderedPageBreak/>
         <w:t xml:space="preserve">A </w:t>
       </w:r>
       <w:r>
@@ -4681,13 +4962,16 @@
         <w:t xml:space="preserve">Sanctioned </w:t>
       </w:r>
       <w:r>
-        <w:t>Action – the action</w:t>
-      </w:r>
-      <w:r>
-        <w:t>(s)</w:t>
-      </w:r>
-      <w:r>
-        <w:t xml:space="preserve"> violating players take at a penalty</w:t>
+        <w:t xml:space="preserve">Action – the </w:t>
+      </w:r>
+      <w:r>
+        <w:t xml:space="preserve">chosen </w:t>
+      </w:r>
+      <w:r>
+        <w:t>action violating players take at a penalty</w:t>
+      </w:r>
+      <w:r>
+        <w:t>, identified by the matching Law Tag on the board</w:t>
       </w:r>
       <w:r>
         <w:t>.</w:t>
@@ -4695,6 +4979,7 @@
     </w:p>
     <w:p>
       <w:r>
+        <w:lastRenderedPageBreak/>
         <w:t xml:space="preserve">Laws that are active and binding to all Players are known as </w:t>
       </w:r>
       <w:r>
@@ -4980,16 +5265,10 @@
         <w:t xml:space="preserve"> </w:t>
       </w:r>
       <w:r>
-        <w:t>R</w:t>
-      </w:r>
-      <w:r>
-        <w:t>oll a</w:t>
-      </w:r>
-      <w:r>
-        <w:t xml:space="preserve"> non-player</w:t>
-      </w:r>
-      <w:r>
-        <w:t xml:space="preserve"> die to set its Threshold. This Law has no sponsor.</w:t>
+        <w:t xml:space="preserve">See 6.5. for </w:t>
+      </w:r>
+      <w:r>
+        <w:t>setting the Threshold and Sanction.</w:t>
       </w:r>
     </w:p>
     <w:p>
@@ -5102,7 +5381,6 @@
         </w:rPr>
       </w:pPr>
       <w:r>
-        <w:lastRenderedPageBreak/>
         <w:t>7</w:t>
       </w:r>
       <w:r>
@@ -5165,6 +5443,7 @@
         </w:numPr>
       </w:pPr>
       <w:r>
+        <w:lastRenderedPageBreak/>
         <w:t>Each player in violation of the Edict pays 1 Coin to the Royal Bank.</w:t>
       </w:r>
     </w:p>
@@ -5268,7 +5547,13 @@
         <w:t>Edict</w:t>
       </w:r>
       <w:r>
-        <w:t xml:space="preserve"> and updates the Threshold to that of the ratified Law.</w:t>
+        <w:t xml:space="preserve"> and updates the Threshold</w:t>
+      </w:r>
+      <w:r>
+        <w:t xml:space="preserve"> and Sanction</w:t>
+      </w:r>
+      <w:r>
+        <w:t xml:space="preserve"> to that of the ratified Law.</w:t>
       </w:r>
     </w:p>
     <w:p>
@@ -5385,39 +5670,39 @@
         <w:pStyle w:val="ListParagraph"/>
       </w:pPr>
       <w:r>
+        <w:t>Troops</w:t>
+      </w:r>
+    </w:p>
+    <w:p>
+      <w:pPr>
+        <w:pStyle w:val="ListParagraph"/>
+      </w:pPr>
+      <w:r>
+        <w:t>Spies</w:t>
+      </w:r>
+    </w:p>
+    <w:p>
+      <w:pPr>
+        <w:pStyle w:val="ListParagraph"/>
+      </w:pPr>
+      <w:r>
+        <w:t>Leaders</w:t>
+      </w:r>
+    </w:p>
+    <w:p>
+      <w:pPr>
+        <w:pStyle w:val="ListParagraph"/>
+      </w:pPr>
+      <w:r>
+        <w:t>King’s Favor</w:t>
+      </w:r>
+    </w:p>
+    <w:p>
+      <w:pPr>
+        <w:pStyle w:val="Heading1"/>
+      </w:pPr>
+      <w:r>
         <w:lastRenderedPageBreak/>
-        <w:t>Troops</w:t>
-      </w:r>
-    </w:p>
-    <w:p>
-      <w:pPr>
-        <w:pStyle w:val="ListParagraph"/>
-      </w:pPr>
-      <w:r>
-        <w:t>Spies</w:t>
-      </w:r>
-    </w:p>
-    <w:p>
-      <w:pPr>
-        <w:pStyle w:val="ListParagraph"/>
-      </w:pPr>
-      <w:r>
-        <w:t>Leaders</w:t>
-      </w:r>
-    </w:p>
-    <w:p>
-      <w:pPr>
-        <w:pStyle w:val="ListParagraph"/>
-      </w:pPr>
-      <w:r>
-        <w:t>King’s Favor</w:t>
-      </w:r>
-    </w:p>
-    <w:p>
-      <w:pPr>
-        <w:pStyle w:val="Heading1"/>
-      </w:pPr>
-      <w:r>
         <w:t xml:space="preserve">8. </w:t>
       </w:r>
       <w:r>
@@ -5619,46 +5904,135 @@
         <w:pStyle w:val="Heading3"/>
       </w:pPr>
       <w:r>
+        <w:t xml:space="preserve">9.1.2. </w:t>
+      </w:r>
+      <w:r>
+        <w:t>Buy high, Sell low</w:t>
+      </w:r>
+    </w:p>
+    <w:p>
+      <w:r>
+        <w:t xml:space="preserve">The Market Rate in this game holds the opposite perspective from normal economics. </w:t>
+      </w:r>
+      <w:r>
+        <w:t>In the real world, we t</w:t>
+      </w:r>
+      <w:r>
+        <w:t>ypically</w:t>
+      </w:r>
+      <w:r>
+        <w:t xml:space="preserve"> </w:t>
+      </w:r>
+      <w:r>
+        <w:t xml:space="preserve">think about </w:t>
+      </w:r>
+      <w:r>
+        <w:t xml:space="preserve">the value of a single </w:t>
+      </w:r>
+      <w:r>
+        <w:t>asset</w:t>
+      </w:r>
+      <w:r>
+        <w:t xml:space="preserve"> and </w:t>
+      </w:r>
+      <w:r>
+        <w:t xml:space="preserve">make decisions based on that value. In this game, however, we </w:t>
+      </w:r>
+      <w:r>
+        <w:t xml:space="preserve">think about the number of assets money can buy and make decisions based on that number. </w:t>
+      </w:r>
+      <w:r>
+        <w:t>The math and economics are the same, just from a different perspective.</w:t>
+      </w:r>
+    </w:p>
+    <w:p>
+      <w:pPr>
+        <w:pStyle w:val="Heading3"/>
+      </w:pPr>
+      <w:r>
         <w:lastRenderedPageBreak/>
-        <w:t xml:space="preserve">9.1.2. </w:t>
-      </w:r>
-      <w:r>
-        <w:t>Buy high, Sell low</w:t>
-      </w:r>
-    </w:p>
-    <w:p>
-      <w:r>
-        <w:t xml:space="preserve">The Market Rate in this game holds the opposite perspective from normal economics. </w:t>
-      </w:r>
-      <w:r>
-        <w:t>In the real world, we t</w:t>
-      </w:r>
-      <w:r>
-        <w:t>ypically</w:t>
+        <w:t xml:space="preserve">9.1.3. Always </w:t>
+      </w:r>
+      <w:r>
+        <w:t>hold on to a few Troops</w:t>
+      </w:r>
+    </w:p>
+    <w:p>
+      <w:r>
+        <w:t>Your Troops protect you from both Greek raids and player Schemes, so it’s a good idea to always keep a few on hand</w:t>
+      </w:r>
+      <w:r>
+        <w:t xml:space="preserve">. Depending on the game and your strategy, this may be difficult to do, </w:t>
+      </w:r>
+      <w:r>
+        <w:t xml:space="preserve">and it’s certainly not required, but it dramatically lowers your risk of </w:t>
+      </w:r>
+      <w:r>
+        <w:t>your engine getting damaged.</w:t>
+      </w:r>
+    </w:p>
+    <w:p>
+      <w:pPr>
+        <w:pStyle w:val="Heading3"/>
+      </w:pPr>
+      <w:r>
+        <w:t xml:space="preserve">9.1.4. Follow the strategy </w:t>
+      </w:r>
+      <w:r>
+        <w:t>formed by your Investments</w:t>
+      </w:r>
+    </w:p>
+    <w:p>
+      <w:r>
+        <w:t xml:space="preserve">Your Investments provide you with </w:t>
+      </w:r>
+      <w:r>
+        <w:t xml:space="preserve">significant efficiency bonuses when taking actions, so many players look for </w:t>
+      </w:r>
+      <w:r>
+        <w:t xml:space="preserve">Investments that compliment one another. Whether you can find complementing cards or not, </w:t>
+      </w:r>
+      <w:r>
+        <w:t>leaning heavily into the actions your Investments improve will likely give you a leg up over the competition</w:t>
+      </w:r>
+      <w:r>
+        <w:t>.</w:t>
+      </w:r>
+    </w:p>
+    <w:p>
+      <w:pPr>
+        <w:pStyle w:val="Heading3"/>
+      </w:pPr>
+      <w:r>
+        <w:t>9.1.5. Form alliances early</w:t>
+      </w:r>
+    </w:p>
+    <w:p>
+      <w:r>
+        <w:t xml:space="preserve">This is a highly political game, and it’s hard to trust anyone for long. However, if you can manage to </w:t>
+      </w:r>
+      <w:r>
+        <w:t xml:space="preserve">form an alliance with someone early, that person will be far less likely to attack you and much more likely to help you. </w:t>
+      </w:r>
+      <w:r>
+        <w:t xml:space="preserve">Even if you don’t get much out of the relationship, it’s often </w:t>
+      </w:r>
+      <w:r>
+        <w:t>helpful to know that at least one person at the table</w:t>
+      </w:r>
+      <w:r>
+        <w:t xml:space="preserve"> has an incentive to not hurt you.</w:t>
       </w:r>
       <w:r>
         <w:t xml:space="preserve"> </w:t>
       </w:r>
-      <w:r>
-        <w:t xml:space="preserve">think about </w:t>
-      </w:r>
-      <w:r>
-        <w:t xml:space="preserve">the value of a single </w:t>
-      </w:r>
-      <w:r>
-        <w:t>asset</w:t>
-      </w:r>
-      <w:r>
-        <w:t xml:space="preserve"> and </w:t>
-      </w:r>
-      <w:r>
-        <w:t xml:space="preserve">make decisions based on that value. In this game, however, we </w:t>
-      </w:r>
-      <w:r>
-        <w:t xml:space="preserve">think about the number of assets money can buy and make decisions based on that number. </w:t>
-      </w:r>
-      <w:r>
-        <w:t>The math and economics are the same, just from a different perspective.</w:t>
+    </w:p>
+    <w:p>
+      <w:pPr>
+        <w:pStyle w:val="Heading2"/>
+      </w:pPr>
+      <w:r>
+        <w:t>9.2. Variants</w:t>
       </w:r>
     </w:p>
     <w:p>
@@ -5666,24 +6040,150 @@
         <w:pStyle w:val="Heading3"/>
       </w:pPr>
       <w:r>
-        <w:t xml:space="preserve">9.1.3. Always </w:t>
-      </w:r>
-      <w:r>
-        <w:t>hold on to a few Troops</w:t>
-      </w:r>
-    </w:p>
-    <w:p>
-      <w:r>
-        <w:t>Your Troops protect you from both Greek raids and player Schemes, so it’s a good idea to always keep a few on hand</w:t>
-      </w:r>
-      <w:r>
-        <w:t xml:space="preserve">. Depending on the game and your strategy, this may be difficult to do, </w:t>
-      </w:r>
-      <w:r>
-        <w:t xml:space="preserve">and it’s certainly not required, but it dramatically lowers your risk of </w:t>
-      </w:r>
-      <w:r>
-        <w:t>your engine getting damaged.</w:t>
+        <w:t>9.2.</w:t>
+      </w:r>
+      <w:r>
+        <w:t>1. Shorter/Longer Games</w:t>
+      </w:r>
+    </w:p>
+    <w:p>
+      <w:r>
+        <w:t>The length of the game can easily be manipulated</w:t>
+      </w:r>
+      <w:r>
+        <w:t xml:space="preserve"> by changing the number of Greek Troops </w:t>
+      </w:r>
+      <w:r>
+        <w:t xml:space="preserve">per player </w:t>
+      </w:r>
+      <w:r>
+        <w:t xml:space="preserve">to </w:t>
+      </w:r>
+      <w:r>
+        <w:t>add to the Reserves at the beginning of the game. Standard games start with 1</w:t>
+      </w:r>
+      <w:r>
+        <w:t>6</w:t>
+      </w:r>
+      <w:r>
+        <w:t xml:space="preserve"> Greeks per player</w:t>
+      </w:r>
+      <w:r>
+        <w:t xml:space="preserve">, causing the game to last roughly </w:t>
+      </w:r>
+      <w:r>
+        <w:t>8</w:t>
+      </w:r>
+      <w:r>
+        <w:t xml:space="preserve"> rounds.</w:t>
+      </w:r>
+      <w:r>
+        <w:t xml:space="preserve"> If you want to play a shorter game, </w:t>
+      </w:r>
+      <w:r>
+        <w:t>lower the starting number of</w:t>
+      </w:r>
+      <w:r>
+        <w:t xml:space="preserve"> Greeks</w:t>
+      </w:r>
+      <w:r>
+        <w:t>. Use 1</w:t>
+      </w:r>
+      <w:r>
+        <w:t>4</w:t>
+      </w:r>
+      <w:r>
+        <w:t xml:space="preserve"> Greeks per player for </w:t>
+      </w:r>
+      <w:r>
+        <w:t xml:space="preserve">7 </w:t>
+      </w:r>
+      <w:r>
+        <w:t xml:space="preserve">rounds, </w:t>
+      </w:r>
+      <w:r>
+        <w:t>12</w:t>
+      </w:r>
+      <w:r>
+        <w:t xml:space="preserve"> Greeks for </w:t>
+      </w:r>
+      <w:r>
+        <w:t>6</w:t>
+      </w:r>
+      <w:r>
+        <w:t xml:space="preserve"> rounds, </w:t>
+      </w:r>
+      <w:r>
+        <w:t>10</w:t>
+      </w:r>
+      <w:r>
+        <w:t xml:space="preserve"> Greeks for </w:t>
+      </w:r>
+      <w:r>
+        <w:t>5</w:t>
+      </w:r>
+      <w:r>
+        <w:t xml:space="preserve"> rounds, </w:t>
+      </w:r>
+      <w:r>
+        <w:t>etc.</w:t>
+      </w:r>
+      <w:r>
+        <w:t xml:space="preserve"> If you want to play a </w:t>
+      </w:r>
+      <w:r>
+        <w:t>longer</w:t>
+      </w:r>
+      <w:r>
+        <w:t xml:space="preserve"> game, </w:t>
+      </w:r>
+      <w:r>
+        <w:t>raise</w:t>
+      </w:r>
+      <w:r>
+        <w:t xml:space="preserve"> the starting number of Greeks. Use </w:t>
+      </w:r>
+      <w:r>
+        <w:t>18</w:t>
+      </w:r>
+      <w:r>
+        <w:t xml:space="preserve"> Greeks per player for </w:t>
+      </w:r>
+      <w:r>
+        <w:t>9</w:t>
+      </w:r>
+      <w:r>
+        <w:t xml:space="preserve"> rounds, </w:t>
+      </w:r>
+      <w:r>
+        <w:t>20</w:t>
+      </w:r>
+      <w:r>
+        <w:t xml:space="preserve"> Greeks for </w:t>
+      </w:r>
+      <w:r>
+        <w:t>10</w:t>
+      </w:r>
+      <w:r>
+        <w:t xml:space="preserve"> rounds, </w:t>
+      </w:r>
+      <w:r>
+        <w:t>22</w:t>
+      </w:r>
+      <w:r>
+        <w:t xml:space="preserve"> Greeks for </w:t>
+      </w:r>
+      <w:r>
+        <w:t>11</w:t>
+      </w:r>
+      <w:r>
+        <w:t xml:space="preserve"> rounds, </w:t>
+      </w:r>
+      <w:r>
+        <w:t>etc.</w:t>
+      </w:r>
+      <w:r>
+        <w:t xml:space="preserve"> Note that the longer the game, the more Edicts your game will have; the shorter the game, the fewer the Edicts.</w:t>
       </w:r>
     </w:p>
     <w:p>
@@ -5691,268 +6191,53 @@
         <w:pStyle w:val="Heading3"/>
       </w:pPr>
       <w:r>
-        <w:t xml:space="preserve">9.1.4. Follow the strategy </w:t>
-      </w:r>
-      <w:r>
-        <w:t>formed by your Investments</w:t>
-      </w:r>
-    </w:p>
-    <w:p>
-      <w:r>
-        <w:t xml:space="preserve">Your Investments provide you with </w:t>
-      </w:r>
-      <w:r>
-        <w:t xml:space="preserve">significant efficiency bonuses when taking actions, so many players look for </w:t>
-      </w:r>
-      <w:r>
-        <w:t xml:space="preserve">Investments that compliment one another. Whether you can find complementing cards or not, </w:t>
-      </w:r>
-      <w:r>
-        <w:t>leaning heavily into the actions your Investments improve will likely give you a leg up over the competition</w:t>
-      </w:r>
-      <w:r>
-        <w:t>.</w:t>
-      </w:r>
-    </w:p>
-    <w:p>
-      <w:pPr>
-        <w:pStyle w:val="Heading3"/>
-      </w:pPr>
-      <w:r>
-        <w:t>9.1.5. Form alliances early</w:t>
-      </w:r>
-    </w:p>
-    <w:p>
-      <w:r>
-        <w:t xml:space="preserve">This is a highly political game, and it’s hard to trust anyone for long. However, if you can manage to </w:t>
-      </w:r>
-      <w:r>
-        <w:t xml:space="preserve">form an alliance with someone early, that person will be far less likely to attack you and much more likely to help you. </w:t>
-      </w:r>
-      <w:r>
-        <w:t xml:space="preserve">Even if you don’t get much out of the relationship, it’s often </w:t>
-      </w:r>
-      <w:r>
-        <w:t>helpful to know that at least one person at the table</w:t>
-      </w:r>
-      <w:r>
-        <w:t xml:space="preserve"> has an incentive to not hurt you.</w:t>
-      </w:r>
-      <w:r>
-        <w:t xml:space="preserve"> </w:t>
-      </w:r>
-    </w:p>
-    <w:p>
-      <w:pPr>
-        <w:pStyle w:val="Heading2"/>
-      </w:pPr>
-      <w:r>
-        <w:t>9.2. Variants</w:t>
-      </w:r>
-    </w:p>
-    <w:p>
-      <w:pPr>
-        <w:pStyle w:val="Heading3"/>
-      </w:pPr>
-      <w:r>
         <w:t>9.2.</w:t>
       </w:r>
       <w:r>
-        <w:t>1. Shorter/Longer Games</w:t>
-      </w:r>
-    </w:p>
-    <w:p>
-      <w:r>
-        <w:t>The length of the game can easily be manipulated</w:t>
-      </w:r>
-      <w:r>
-        <w:t xml:space="preserve"> by changing the number of Greek Troops </w:t>
-      </w:r>
-      <w:r>
-        <w:t xml:space="preserve">per player </w:t>
-      </w:r>
-      <w:r>
-        <w:t xml:space="preserve">to </w:t>
-      </w:r>
-      <w:r>
-        <w:t>add to the Reserves at the beginning of the game. Standard games start with 1</w:t>
-      </w:r>
-      <w:r>
-        <w:t>6</w:t>
-      </w:r>
-      <w:r>
-        <w:t xml:space="preserve"> Greeks per player</w:t>
-      </w:r>
-      <w:r>
-        <w:t xml:space="preserve">, causing the game to last roughly </w:t>
-      </w:r>
-      <w:r>
-        <w:t>8</w:t>
-      </w:r>
-      <w:r>
-        <w:t xml:space="preserve"> rounds.</w:t>
-      </w:r>
-      <w:r>
-        <w:t xml:space="preserve"> If you want to play a shorter game, </w:t>
-      </w:r>
-      <w:r>
-        <w:t>lower the starting number of</w:t>
-      </w:r>
-      <w:r>
-        <w:t xml:space="preserve"> Greeks</w:t>
-      </w:r>
-      <w:r>
-        <w:t>. Use 1</w:t>
-      </w:r>
-      <w:r>
-        <w:t>4</w:t>
-      </w:r>
-      <w:r>
-        <w:t xml:space="preserve"> Greeks per player for </w:t>
-      </w:r>
-      <w:r>
-        <w:t xml:space="preserve">7 </w:t>
-      </w:r>
-      <w:r>
-        <w:t xml:space="preserve">rounds, </w:t>
-      </w:r>
-      <w:r>
-        <w:t>12</w:t>
-      </w:r>
-      <w:r>
-        <w:t xml:space="preserve"> Greeks for </w:t>
-      </w:r>
-      <w:r>
-        <w:t>6</w:t>
-      </w:r>
-      <w:r>
-        <w:t xml:space="preserve"> rounds, </w:t>
-      </w:r>
-      <w:r>
-        <w:t>10</w:t>
-      </w:r>
-      <w:r>
-        <w:t xml:space="preserve"> Greeks for </w:t>
-      </w:r>
-      <w:r>
-        <w:t>5</w:t>
-      </w:r>
-      <w:r>
-        <w:t xml:space="preserve"> rounds, </w:t>
-      </w:r>
-      <w:r>
-        <w:t>etc.</w:t>
-      </w:r>
-      <w:r>
-        <w:t xml:space="preserve"> If you want to play a </w:t>
-      </w:r>
-      <w:r>
-        <w:t>longer</w:t>
-      </w:r>
-      <w:r>
-        <w:t xml:space="preserve"> game, </w:t>
-      </w:r>
-      <w:r>
-        <w:t>raise</w:t>
-      </w:r>
-      <w:r>
-        <w:t xml:space="preserve"> the starting number of Greeks. Use </w:t>
-      </w:r>
-      <w:r>
-        <w:t>18</w:t>
-      </w:r>
-      <w:r>
-        <w:t xml:space="preserve"> Greeks per player for </w:t>
-      </w:r>
-      <w:r>
-        <w:t>9</w:t>
-      </w:r>
-      <w:r>
-        <w:t xml:space="preserve"> rounds, </w:t>
-      </w:r>
-      <w:r>
-        <w:t>20</w:t>
-      </w:r>
-      <w:r>
-        <w:t xml:space="preserve"> Greeks for </w:t>
-      </w:r>
-      <w:r>
-        <w:t>10</w:t>
-      </w:r>
-      <w:r>
-        <w:t xml:space="preserve"> rounds, </w:t>
-      </w:r>
-      <w:r>
-        <w:t>22</w:t>
-      </w:r>
-      <w:r>
-        <w:t xml:space="preserve"> Greeks for </w:t>
-      </w:r>
-      <w:r>
-        <w:t>11</w:t>
-      </w:r>
-      <w:r>
-        <w:t xml:space="preserve"> rounds, </w:t>
-      </w:r>
-      <w:r>
-        <w:t>etc.</w:t>
-      </w:r>
-      <w:r>
-        <w:t xml:space="preserve"> Note that the longer the game, the more Edicts your game will have; the shorter the game, the fewer the Edicts.</w:t>
-      </w:r>
-    </w:p>
-    <w:p>
-      <w:pPr>
-        <w:pStyle w:val="Heading3"/>
-      </w:pPr>
+        <w:t>2</w:t>
+      </w:r>
+      <w:r>
+        <w:t>. Alexander the Great</w:t>
+      </w:r>
+    </w:p>
+    <w:p>
+      <w:r>
+        <w:t xml:space="preserve">For player groups </w:t>
+      </w:r>
+      <w:r>
+        <w:t xml:space="preserve">looking for </w:t>
+      </w:r>
+      <w:r>
+        <w:t xml:space="preserve">a more cooperative challenge or </w:t>
+      </w:r>
+      <w:r>
+        <w:t xml:space="preserve">more pressure </w:t>
+      </w:r>
+      <w:r>
+        <w:t xml:space="preserve">from the battlefront, add a step to the </w:t>
+      </w:r>
+      <w:r>
+        <w:t xml:space="preserve">end of the </w:t>
+      </w:r>
+      <w:r>
+        <w:t>Reports Phase where the Greek Reserves receive reinforcements.</w:t>
+      </w:r>
+      <w:r>
+        <w:t xml:space="preserve"> After checking if the Greeks have been defeated, roll </w:t>
+      </w:r>
+      <w:r>
+        <w:t xml:space="preserve">a single die and add the </w:t>
+      </w:r>
+      <w:r>
+        <w:t>corresponding number of Greeks to the Reserves.</w:t>
+      </w:r>
+      <w:r>
+        <w:t xml:space="preserve"> If the Greeks are completely defeated, do not reinforce them and proceed to the end of the game.</w:t>
+      </w:r>
+    </w:p>
+    <w:p>
       <w:r>
         <w:lastRenderedPageBreak/>
-        <w:t>9.2.</w:t>
-      </w:r>
-      <w:r>
-        <w:t>2</w:t>
-      </w:r>
-      <w:r>
-        <w:t>. Alexander the Great</w:t>
-      </w:r>
-    </w:p>
-    <w:p>
-      <w:r>
-        <w:t xml:space="preserve">For player groups </w:t>
-      </w:r>
-      <w:r>
-        <w:t xml:space="preserve">looking for </w:t>
-      </w:r>
-      <w:r>
-        <w:t xml:space="preserve">a more cooperative challenge or </w:t>
-      </w:r>
-      <w:r>
-        <w:t xml:space="preserve">more pressure </w:t>
-      </w:r>
-      <w:r>
-        <w:t xml:space="preserve">from the battlefront, add a step to the </w:t>
-      </w:r>
-      <w:r>
-        <w:t xml:space="preserve">end of the </w:t>
-      </w:r>
-      <w:r>
-        <w:t>Reports Phase where the Greek Reserves receive reinforcements.</w:t>
-      </w:r>
-      <w:r>
-        <w:t xml:space="preserve"> After checking if the Greeks have been defeated, roll </w:t>
-      </w:r>
-      <w:r>
-        <w:t xml:space="preserve">a single die and add the </w:t>
-      </w:r>
-      <w:r>
-        <w:t>corresponding number of Greeks to the Reserves.</w:t>
-      </w:r>
-      <w:r>
-        <w:t xml:space="preserve"> If the Greeks are completely defeated, do not reinforce them and proceed to the end of the game.</w:t>
-      </w:r>
-    </w:p>
-    <w:p>
-      <w:r>
         <w:t xml:space="preserve">This will cause the game to have a </w:t>
       </w:r>
       <w:r>
@@ -6131,7 +6416,7 @@
 </file>
 
 <file path=word/numbering.xml><?xml version="1.0" encoding="utf-8"?>
-<w:numbering xmlns:wpc="http://schemas.microsoft.com/office/word/2010/wordprocessingCanvas" xmlns:cx="http://schemas.microsoft.com/office/drawing/2014/chartex" xmlns:cx1="http://schemas.microsoft.com/office/drawing/2015/9/8/chartex" xmlns:cx2="http://schemas.microsoft.com/office/drawing/2015/10/21/chartex" xmlns:cx3="http://schemas.microsoft.com/office/drawing/2016/5/9/chartex" xmlns:cx4="http://schemas.microsoft.com/office/drawing/2016/5/10/chartex" xmlns:cx5="http://schemas.microsoft.com/office/drawing/2016/5/11/chartex" xmlns:cx6="http://schemas.microsoft.com/office/drawing/2016/5/12/chartex" xmlns:cx7="http://schemas.microsoft.com/office/drawing/2016/5/13/chartex" xmlns:cx8="http://schemas.microsoft.com/office/drawing/2016/5/14/chartex" xmlns:mc="http://schemas.openxmlformats.org/markup-compatibility/2006" xmlns:aink="http://schemas.microsoft.com/office/drawing/2016/ink" xmlns:am3d="http://schemas.microsoft.com/office/drawing/2017/model3d" xmlns:o="urn:schemas-microsoft-com:office:office" xmlns:oel="http://schemas.microsoft.com/office/2019/extlst" xmlns:r="http://schemas.openxmlformats.org/officeDocument/2006/relationships" xmlns:m="http://schemas.openxmlformats.org/officeDocument/2006/math" xmlns:v="urn:schemas-microsoft-com:vml" xmlns:wp14="http://schemas.microsoft.com/office/word/2010/wordprocessingDrawing" xmlns:wp="http://schemas.openxmlformats.org/drawingml/2006/wordprocessingDrawing" xmlns:w10="urn:schemas-microsoft-com:office:word" xmlns:w="http://schemas.openxmlformats.org/wordprocessingml/2006/main" xmlns:w14="http://schemas.microsoft.com/office/word/2010/wordml" xmlns:w15="http://schemas.microsoft.com/office/word/2012/wordml" xmlns:w16cei="http://schemas.microsoft.com/office/word/2026/wordml/cei" xmlns:w16cex="http://schemas.microsoft.com/office/word/2018/wordml/cex" xmlns:w16cid="http://schemas.microsoft.com/office/word/2016/wordml/cid" xmlns:w16="http://schemas.microsoft.com/office/word/2018/wordml" xmlns:w16du="http://schemas.microsoft.com/office/word/2023/wordml/word16du" xmlns:w16sdtdh="http://schemas.microsoft.com/office/word/2020/wordml/sdtdatahash" xmlns:w16sdtfl="http://schemas.microsoft.com/office/word/2024/wordml/sdtformatlock" xmlns:w16se="http://schemas.microsoft.com/office/word/2015/wordml/symex" xmlns:wpg="http://schemas.microsoft.com/office/word/2010/wordprocessingGroup" xmlns:wpi="http://schemas.microsoft.com/office/word/2010/wordprocessingInk" xmlns:wne="http://schemas.microsoft.com/office/word/2006/wordml" xmlns:wps="http://schemas.microsoft.com/office/word/2010/wordprocessingShape" mc:Ignorable="w14 w15 w16se w16cid w16 w16cex w16sdtdh w16sdtfl w16du wp14">
+<w:numbering xmlns:wpc="http://schemas.microsoft.com/office/word/2010/wordprocessingCanvas" xmlns:cx="http://schemas.microsoft.com/office/drawing/2014/chartex" xmlns:cx1="http://schemas.microsoft.com/office/drawing/2015/9/8/chartex" xmlns:cx2="http://schemas.microsoft.com/office/drawing/2015/10/21/chartex" xmlns:cx3="http://schemas.microsoft.com/office/drawing/2016/5/9/chartex" xmlns:cx4="http://schemas.microsoft.com/office/drawing/2016/5/10/chartex" xmlns:cx5="http://schemas.microsoft.com/office/drawing/2016/5/11/chartex" xmlns:cx6="http://schemas.microsoft.com/office/drawing/2016/5/12/chartex" xmlns:cx7="http://schemas.microsoft.com/office/drawing/2016/5/13/chartex" xmlns:cx8="http://schemas.microsoft.com/office/drawing/2016/5/14/chartex" xmlns:mc="http://schemas.openxmlformats.org/markup-compatibility/2006" xmlns:aink="http://schemas.microsoft.com/office/drawing/2016/ink" xmlns:am3d="http://schemas.microsoft.com/office/drawing/2017/model3d" xmlns:o="urn:schemas-microsoft-com:office:office" xmlns:oel="http://schemas.microsoft.com/office/2019/extlst" xmlns:r="http://schemas.openxmlformats.org/officeDocument/2006/relationships" xmlns:m="http://schemas.openxmlformats.org/officeDocument/2006/math" xmlns:v="urn:schemas-microsoft-com:vml" xmlns:wp14="http://schemas.microsoft.com/office/word/2010/wordprocessingDrawing" xmlns:wp="http://schemas.openxmlformats.org/drawingml/2006/wordprocessingDrawing" xmlns:w10="urn:schemas-microsoft-com:office:word" xmlns:w="http://schemas.openxmlformats.org/wordprocessingml/2006/main" xmlns:w14="http://schemas.microsoft.com/office/word/2010/wordml" xmlns:w15="http://schemas.microsoft.com/office/word/2012/wordml" xmlns:w16cex="http://schemas.microsoft.com/office/word/2018/wordml/cex" xmlns:w16cid="http://schemas.microsoft.com/office/word/2016/wordml/cid" xmlns:w16="http://schemas.microsoft.com/office/word/2018/wordml" xmlns:w16du="http://schemas.microsoft.com/office/word/2023/wordml/word16du" xmlns:w16sdtdh="http://schemas.microsoft.com/office/word/2020/wordml/sdtdatahash" xmlns:w16sdtfl="http://schemas.microsoft.com/office/word/2024/wordml/sdtformatlock" xmlns:w16se="http://schemas.microsoft.com/office/word/2015/wordml/symex" xmlns:wpg="http://schemas.microsoft.com/office/word/2010/wordprocessingGroup" xmlns:wpi="http://schemas.microsoft.com/office/word/2010/wordprocessingInk" xmlns:wne="http://schemas.microsoft.com/office/word/2006/wordml" xmlns:wps="http://schemas.microsoft.com/office/word/2010/wordprocessingShape" mc:Ignorable="w14 w15 w16se w16cid w16 w16cex w16sdtdh w16sdtfl w16du wp14">
   <w:abstractNum w:abstractNumId="0" w15:restartNumberingAfterBreak="0">
     <w:nsid w:val="01065FFC"/>
     <w:multiLevelType w:val="multilevel"/>
@@ -7253,6 +7538,148 @@
     </w:lvl>
   </w:abstractNum>
   <w:abstractNum w:abstractNumId="8" w15:restartNumberingAfterBreak="0">
+    <w:nsid w:val="3FDA56C3"/>
+    <w:multiLevelType w:val="multilevel"/>
+    <w:tmpl w:val="CB3AE512"/>
+    <w:lvl w:ilvl="0">
+      <w:start w:val="1"/>
+      <w:numFmt w:val="bullet"/>
+      <w:lvlText w:val=""/>
+      <w:lvlJc w:val="left"/>
+      <w:pPr>
+        <w:tabs>
+          <w:tab w:val="num" w:pos="720"/>
+        </w:tabs>
+        <w:ind w:left="720" w:hanging="360"/>
+      </w:pPr>
+      <w:rPr>
+        <w:rFonts w:ascii="Symbol" w:hAnsi="Symbol" w:hint="default"/>
+        <w:sz w:val="20"/>
+      </w:rPr>
+    </w:lvl>
+    <w:lvl w:ilvl="1">
+      <w:start w:val="1"/>
+      <w:numFmt w:val="bullet"/>
+      <w:lvlText w:val="o"/>
+      <w:lvlJc w:val="left"/>
+      <w:pPr>
+        <w:tabs>
+          <w:tab w:val="num" w:pos="1440"/>
+        </w:tabs>
+        <w:ind w:left="1440" w:hanging="360"/>
+      </w:pPr>
+      <w:rPr>
+        <w:rFonts w:ascii="Courier New" w:hAnsi="Courier New" w:hint="default"/>
+        <w:sz w:val="20"/>
+      </w:rPr>
+    </w:lvl>
+    <w:lvl w:ilvl="2">
+      <w:start w:val="1"/>
+      <w:numFmt w:val="decimal"/>
+      <w:lvlText w:val="%3."/>
+      <w:lvlJc w:val="left"/>
+      <w:pPr>
+        <w:ind w:left="2160" w:hanging="360"/>
+      </w:pPr>
+    </w:lvl>
+    <w:lvl w:ilvl="3" w:tentative="1">
+      <w:start w:val="1"/>
+      <w:numFmt w:val="bullet"/>
+      <w:lvlText w:val=""/>
+      <w:lvlJc w:val="left"/>
+      <w:pPr>
+        <w:tabs>
+          <w:tab w:val="num" w:pos="2880"/>
+        </w:tabs>
+        <w:ind w:left="2880" w:hanging="360"/>
+      </w:pPr>
+      <w:rPr>
+        <w:rFonts w:ascii="Wingdings" w:hAnsi="Wingdings" w:hint="default"/>
+        <w:sz w:val="20"/>
+      </w:rPr>
+    </w:lvl>
+    <w:lvl w:ilvl="4" w:tentative="1">
+      <w:start w:val="1"/>
+      <w:numFmt w:val="bullet"/>
+      <w:lvlText w:val=""/>
+      <w:lvlJc w:val="left"/>
+      <w:pPr>
+        <w:tabs>
+          <w:tab w:val="num" w:pos="3600"/>
+        </w:tabs>
+        <w:ind w:left="3600" w:hanging="360"/>
+      </w:pPr>
+      <w:rPr>
+        <w:rFonts w:ascii="Wingdings" w:hAnsi="Wingdings" w:hint="default"/>
+        <w:sz w:val="20"/>
+      </w:rPr>
+    </w:lvl>
+    <w:lvl w:ilvl="5" w:tentative="1">
+      <w:start w:val="1"/>
+      <w:numFmt w:val="bullet"/>
+      <w:lvlText w:val=""/>
+      <w:lvlJc w:val="left"/>
+      <w:pPr>
+        <w:tabs>
+          <w:tab w:val="num" w:pos="4320"/>
+        </w:tabs>
+        <w:ind w:left="4320" w:hanging="360"/>
+      </w:pPr>
+      <w:rPr>
+        <w:rFonts w:ascii="Wingdings" w:hAnsi="Wingdings" w:hint="default"/>
+        <w:sz w:val="20"/>
+      </w:rPr>
+    </w:lvl>
+    <w:lvl w:ilvl="6" w:tentative="1">
+      <w:start w:val="1"/>
+      <w:numFmt w:val="bullet"/>
+      <w:lvlText w:val=""/>
+      <w:lvlJc w:val="left"/>
+      <w:pPr>
+        <w:tabs>
+          <w:tab w:val="num" w:pos="5040"/>
+        </w:tabs>
+        <w:ind w:left="5040" w:hanging="360"/>
+      </w:pPr>
+      <w:rPr>
+        <w:rFonts w:ascii="Wingdings" w:hAnsi="Wingdings" w:hint="default"/>
+        <w:sz w:val="20"/>
+      </w:rPr>
+    </w:lvl>
+    <w:lvl w:ilvl="7" w:tentative="1">
+      <w:start w:val="1"/>
+      <w:numFmt w:val="bullet"/>
+      <w:lvlText w:val=""/>
+      <w:lvlJc w:val="left"/>
+      <w:pPr>
+        <w:tabs>
+          <w:tab w:val="num" w:pos="5760"/>
+        </w:tabs>
+        <w:ind w:left="5760" w:hanging="360"/>
+      </w:pPr>
+      <w:rPr>
+        <w:rFonts w:ascii="Wingdings" w:hAnsi="Wingdings" w:hint="default"/>
+        <w:sz w:val="20"/>
+      </w:rPr>
+    </w:lvl>
+    <w:lvl w:ilvl="8" w:tentative="1">
+      <w:start w:val="1"/>
+      <w:numFmt w:val="bullet"/>
+      <w:lvlText w:val=""/>
+      <w:lvlJc w:val="left"/>
+      <w:pPr>
+        <w:tabs>
+          <w:tab w:val="num" w:pos="6480"/>
+        </w:tabs>
+        <w:ind w:left="6480" w:hanging="360"/>
+      </w:pPr>
+      <w:rPr>
+        <w:rFonts w:ascii="Wingdings" w:hAnsi="Wingdings" w:hint="default"/>
+        <w:sz w:val="20"/>
+      </w:rPr>
+    </w:lvl>
+  </w:abstractNum>
+  <w:abstractNum w:abstractNumId="9" w15:restartNumberingAfterBreak="0">
     <w:nsid w:val="44F356B4"/>
     <w:multiLevelType w:val="multilevel"/>
     <w:tmpl w:val="EF06727A"/>
@@ -7401,7 +7828,7 @@
       </w:rPr>
     </w:lvl>
   </w:abstractNum>
-  <w:abstractNum w:abstractNumId="9" w15:restartNumberingAfterBreak="0">
+  <w:abstractNum w:abstractNumId="10" w15:restartNumberingAfterBreak="0">
     <w:nsid w:val="51032369"/>
     <w:multiLevelType w:val="multilevel"/>
     <w:tmpl w:val="562EA79A"/>
@@ -7550,7 +7977,7 @@
       </w:rPr>
     </w:lvl>
   </w:abstractNum>
-  <w:abstractNum w:abstractNumId="10" w15:restartNumberingAfterBreak="0">
+  <w:abstractNum w:abstractNumId="11" w15:restartNumberingAfterBreak="0">
     <w:nsid w:val="5293254C"/>
     <w:multiLevelType w:val="multilevel"/>
     <w:tmpl w:val="FD12623A"/>
@@ -7699,7 +8126,7 @@
       </w:rPr>
     </w:lvl>
   </w:abstractNum>
-  <w:abstractNum w:abstractNumId="11" w15:restartNumberingAfterBreak="0">
+  <w:abstractNum w:abstractNumId="12" w15:restartNumberingAfterBreak="0">
     <w:nsid w:val="5AC7533C"/>
     <w:multiLevelType w:val="hybridMultilevel"/>
     <w:tmpl w:val="60F6577E"/>
@@ -7788,7 +8215,7 @@
       </w:pPr>
     </w:lvl>
   </w:abstractNum>
-  <w:abstractNum w:abstractNumId="12" w15:restartNumberingAfterBreak="0">
+  <w:abstractNum w:abstractNumId="13" w15:restartNumberingAfterBreak="0">
     <w:nsid w:val="6AAB5DDD"/>
     <w:multiLevelType w:val="multilevel"/>
     <w:tmpl w:val="4CEA439C"/>
@@ -7825,7 +8252,7 @@
         <w:sz w:val="20"/>
       </w:rPr>
     </w:lvl>
-    <w:lvl w:ilvl="2" w:tentative="1">
+    <w:lvl w:ilvl="2">
       <w:start w:val="1"/>
       <w:numFmt w:val="bullet"/>
       <w:lvlText w:val=""/>
@@ -7841,7 +8268,7 @@
         <w:sz w:val="20"/>
       </w:rPr>
     </w:lvl>
-    <w:lvl w:ilvl="3" w:tentative="1">
+    <w:lvl w:ilvl="3">
       <w:start w:val="1"/>
       <w:numFmt w:val="bullet"/>
       <w:lvlText w:val=""/>
@@ -7938,7 +8365,7 @@
       </w:rPr>
     </w:lvl>
   </w:abstractNum>
-  <w:abstractNum w:abstractNumId="13" w15:restartNumberingAfterBreak="0">
+  <w:abstractNum w:abstractNumId="14" w15:restartNumberingAfterBreak="0">
     <w:nsid w:val="7E815FE7"/>
     <w:multiLevelType w:val="multilevel"/>
     <w:tmpl w:val="CEE4AE80"/>
@@ -8094,13 +8521,13 @@
     <w:abstractNumId w:val="7"/>
   </w:num>
   <w:num w:numId="3" w16cid:durableId="113134803">
-    <w:abstractNumId w:val="12"/>
+    <w:abstractNumId w:val="13"/>
   </w:num>
   <w:num w:numId="4" w16cid:durableId="1705208301">
     <w:abstractNumId w:val="0"/>
   </w:num>
   <w:num w:numId="5" w16cid:durableId="730613728">
-    <w:abstractNumId w:val="9"/>
+    <w:abstractNumId w:val="10"/>
   </w:num>
   <w:num w:numId="6" w16cid:durableId="886719058">
     <w:abstractNumId w:val="6"/>
@@ -8112,7 +8539,7 @@
     <w:abstractNumId w:val="1"/>
   </w:num>
   <w:num w:numId="9" w16cid:durableId="343436975">
-    <w:abstractNumId w:val="8"/>
+    <w:abstractNumId w:val="9"/>
   </w:num>
   <w:num w:numId="10" w16cid:durableId="946817541">
     <w:abstractNumId w:val="5"/>
@@ -8121,13 +8548,16 @@
     <w:abstractNumId w:val="2"/>
   </w:num>
   <w:num w:numId="12" w16cid:durableId="2001616775">
-    <w:abstractNumId w:val="13"/>
+    <w:abstractNumId w:val="14"/>
   </w:num>
   <w:num w:numId="13" w16cid:durableId="1418285265">
-    <w:abstractNumId w:val="10"/>
+    <w:abstractNumId w:val="11"/>
   </w:num>
   <w:num w:numId="14" w16cid:durableId="971668183">
-    <w:abstractNumId w:val="11"/>
+    <w:abstractNumId w:val="12"/>
+  </w:num>
+  <w:num w:numId="15" w16cid:durableId="854420926">
+    <w:abstractNumId w:val="8"/>
   </w:num>
   <w:numIdMacAtCleanup w:val="12"/>
 </w:numbering>

</xml_diff>